<commit_message>
Data Collection pipeline done
</commit_message>
<xml_diff>
--- a/project_capstone.docx
+++ b/project_capstone.docx
@@ -2361,6 +2361,1774 @@
         </w:rPr>
         <w:t>void false positives &amp; dead domains</w:t>
       </w:r>
+      <w:r>
+        <w:rPr>
+          <w:color w:val="000000" w:themeColor="text1"/>
+          <w:sz w:val="32"/>
+          <w:szCs w:val="32"/>
+        </w:rPr>
+        <w:t>, populate in controlled batches to prevent</w:t>
+      </w:r>
+    </w:p>
+    <w:p>
+      <w:pPr>
+        <w:pStyle w:val="ListParagraph"/>
+        <w:numPr>
+          <w:ilvl w:val="0"/>
+          <w:numId w:val="11"/>
+        </w:numPr>
+        <w:rPr>
+          <w:color w:val="000000" w:themeColor="text1"/>
+          <w:sz w:val="32"/>
+          <w:szCs w:val="32"/>
+          <w:lang w:val="en-US"/>
+        </w:rPr>
+      </w:pPr>
+      <w:r>
+        <w:rPr>
+          <w:color w:val="000000" w:themeColor="text1"/>
+          <w:sz w:val="32"/>
+          <w:szCs w:val="32"/>
+        </w:rPr>
+        <w:t xml:space="preserve">Crypto sites we need – </w:t>
+      </w:r>
+    </w:p>
+    <w:p>
+      <w:pPr>
+        <w:pStyle w:val="ListParagraph"/>
+        <w:rPr>
+          <w:color w:val="000000" w:themeColor="text1"/>
+          <w:sz w:val="32"/>
+          <w:szCs w:val="32"/>
+        </w:rPr>
+      </w:pPr>
+      <w:r>
+        <w:rPr>
+          <w:color w:val="000000" w:themeColor="text1"/>
+          <w:sz w:val="32"/>
+          <w:szCs w:val="32"/>
+        </w:rPr>
+        <w:t>Fast crawl</w:t>
+      </w:r>
+      <w:r>
+        <w:rPr>
+          <w:color w:val="000000" w:themeColor="text1"/>
+          <w:sz w:val="32"/>
+          <w:szCs w:val="32"/>
+        </w:rPr>
+        <w:t xml:space="preserve"> – 200-300</w:t>
+      </w:r>
+    </w:p>
+    <w:p>
+      <w:pPr>
+        <w:pStyle w:val="ListParagraph"/>
+        <w:rPr>
+          <w:color w:val="000000" w:themeColor="text1"/>
+          <w:sz w:val="32"/>
+          <w:szCs w:val="32"/>
+        </w:rPr>
+      </w:pPr>
+      <w:r>
+        <w:rPr>
+          <w:color w:val="000000" w:themeColor="text1"/>
+          <w:sz w:val="32"/>
+          <w:szCs w:val="32"/>
+        </w:rPr>
+        <w:t>Validated – 100 – 150</w:t>
+      </w:r>
+    </w:p>
+    <w:p>
+      <w:pPr>
+        <w:pStyle w:val="ListParagraph"/>
+        <w:rPr>
+          <w:color w:val="000000" w:themeColor="text1"/>
+          <w:sz w:val="32"/>
+          <w:szCs w:val="32"/>
+        </w:rPr>
+      </w:pPr>
+      <w:r>
+        <w:rPr>
+          <w:color w:val="000000" w:themeColor="text1"/>
+          <w:sz w:val="32"/>
+          <w:szCs w:val="32"/>
+        </w:rPr>
+        <w:t>Deep crawl – 60 – 100</w:t>
+      </w:r>
+    </w:p>
+    <w:p>
+      <w:pPr>
+        <w:pStyle w:val="ListParagraph"/>
+        <w:rPr>
+          <w:color w:val="000000" w:themeColor="text1"/>
+          <w:sz w:val="32"/>
+          <w:szCs w:val="32"/>
+        </w:rPr>
+      </w:pPr>
+    </w:p>
+    <w:p>
+      <w:pPr>
+        <w:pStyle w:val="ListParagraph"/>
+        <w:numPr>
+          <w:ilvl w:val="0"/>
+          <w:numId w:val="11"/>
+        </w:numPr>
+        <w:rPr>
+          <w:color w:val="000000" w:themeColor="text1"/>
+          <w:sz w:val="32"/>
+          <w:szCs w:val="32"/>
+        </w:rPr>
+      </w:pPr>
+      <w:r>
+        <w:rPr>
+          <w:color w:val="000000" w:themeColor="text1"/>
+          <w:sz w:val="32"/>
+          <w:szCs w:val="32"/>
+        </w:rPr>
+        <w:lastRenderedPageBreak/>
+        <w:t xml:space="preserve">Likely cryptojacking </w:t>
+      </w:r>
+      <w:r>
+        <w:rPr>
+          <w:color w:val="000000" w:themeColor="text1"/>
+          <w:sz w:val="32"/>
+          <w:szCs w:val="32"/>
+        </w:rPr>
+        <w:t xml:space="preserve">candidates -&gt; </w:t>
+      </w:r>
+      <w:proofErr w:type="spellStart"/>
+      <w:r>
+        <w:rPr>
+          <w:color w:val="000000" w:themeColor="text1"/>
+          <w:sz w:val="32"/>
+          <w:szCs w:val="32"/>
+        </w:rPr>
+        <w:t>wasm</w:t>
+      </w:r>
+      <w:proofErr w:type="spellEnd"/>
+      <w:r>
+        <w:rPr>
+          <w:color w:val="000000" w:themeColor="text1"/>
+          <w:sz w:val="32"/>
+          <w:szCs w:val="32"/>
+        </w:rPr>
+        <w:t xml:space="preserve"> presence, abnormal runtime </w:t>
+      </w:r>
+      <w:proofErr w:type="gramStart"/>
+      <w:r>
+        <w:rPr>
+          <w:color w:val="000000" w:themeColor="text1"/>
+          <w:sz w:val="32"/>
+          <w:szCs w:val="32"/>
+        </w:rPr>
+        <w:t>behaviour(</w:t>
+      </w:r>
+      <w:proofErr w:type="spellStart"/>
+      <w:proofErr w:type="gramEnd"/>
+      <w:r>
+        <w:rPr>
+          <w:color w:val="000000" w:themeColor="text1"/>
+          <w:sz w:val="32"/>
+          <w:szCs w:val="32"/>
+        </w:rPr>
+        <w:t>cpu</w:t>
+      </w:r>
+      <w:proofErr w:type="spellEnd"/>
+      <w:r>
+        <w:rPr>
+          <w:color w:val="000000" w:themeColor="text1"/>
+          <w:sz w:val="32"/>
+          <w:szCs w:val="32"/>
+        </w:rPr>
+        <w:t xml:space="preserve"> + heap growth)</w:t>
+      </w:r>
+    </w:p>
+    <w:p>
+      <w:pPr>
+        <w:pStyle w:val="ListParagraph"/>
+        <w:numPr>
+          <w:ilvl w:val="0"/>
+          <w:numId w:val="11"/>
+        </w:numPr>
+        <w:rPr>
+          <w:color w:val="000000" w:themeColor="text1"/>
+          <w:sz w:val="32"/>
+          <w:szCs w:val="32"/>
+        </w:rPr>
+      </w:pPr>
+      <w:r>
+        <w:rPr>
+          <w:color w:val="000000" w:themeColor="text1"/>
+          <w:sz w:val="32"/>
+          <w:szCs w:val="32"/>
+        </w:rPr>
+        <w:t xml:space="preserve"> </w:t>
+      </w:r>
+      <w:r>
+        <w:rPr>
+          <w:color w:val="000000" w:themeColor="text1"/>
+          <w:sz w:val="32"/>
+          <w:szCs w:val="32"/>
+        </w:rPr>
+        <w:t xml:space="preserve">Modern </w:t>
+      </w:r>
+      <w:r>
+        <w:rPr>
+          <w:color w:val="000000" w:themeColor="text1"/>
+          <w:sz w:val="32"/>
+          <w:szCs w:val="32"/>
+        </w:rPr>
+        <w:t>browser</w:t>
+      </w:r>
+      <w:r>
+        <w:rPr>
+          <w:color w:val="000000" w:themeColor="text1"/>
+          <w:sz w:val="32"/>
+          <w:szCs w:val="32"/>
+        </w:rPr>
+        <w:t xml:space="preserve"> </w:t>
+      </w:r>
+      <w:r>
+        <w:rPr>
+          <w:color w:val="000000" w:themeColor="text1"/>
+          <w:sz w:val="32"/>
+          <w:szCs w:val="32"/>
+        </w:rPr>
+        <w:t xml:space="preserve">almost always </w:t>
+      </w:r>
+      <w:proofErr w:type="gramStart"/>
+      <w:r>
+        <w:rPr>
+          <w:color w:val="000000" w:themeColor="text1"/>
+          <w:sz w:val="32"/>
+          <w:szCs w:val="32"/>
+        </w:rPr>
+        <w:t>use</w:t>
+      </w:r>
+      <w:proofErr w:type="gramEnd"/>
+      <w:r>
+        <w:rPr>
+          <w:color w:val="000000" w:themeColor="text1"/>
+          <w:sz w:val="32"/>
+          <w:szCs w:val="32"/>
+        </w:rPr>
+        <w:t xml:space="preserve"> </w:t>
+      </w:r>
+      <w:proofErr w:type="spellStart"/>
+      <w:r>
+        <w:rPr>
+          <w:color w:val="000000" w:themeColor="text1"/>
+          <w:sz w:val="32"/>
+          <w:szCs w:val="32"/>
+        </w:rPr>
+        <w:t>wasm</w:t>
+      </w:r>
+      <w:proofErr w:type="spellEnd"/>
+      <w:r>
+        <w:rPr>
+          <w:color w:val="000000" w:themeColor="text1"/>
+          <w:sz w:val="32"/>
+          <w:szCs w:val="32"/>
+        </w:rPr>
+        <w:t xml:space="preserve">, normal page load rarely </w:t>
+      </w:r>
+      <w:proofErr w:type="gramStart"/>
+      <w:r>
+        <w:rPr>
+          <w:color w:val="000000" w:themeColor="text1"/>
+          <w:sz w:val="32"/>
+          <w:szCs w:val="32"/>
+        </w:rPr>
+        <w:t>need</w:t>
+      </w:r>
+      <w:proofErr w:type="gramEnd"/>
+      <w:r>
+        <w:rPr>
+          <w:color w:val="000000" w:themeColor="text1"/>
+          <w:sz w:val="32"/>
+          <w:szCs w:val="32"/>
+        </w:rPr>
+        <w:t xml:space="preserve"> </w:t>
+      </w:r>
+      <w:proofErr w:type="spellStart"/>
+      <w:r>
+        <w:rPr>
+          <w:color w:val="000000" w:themeColor="text1"/>
+          <w:sz w:val="32"/>
+          <w:szCs w:val="32"/>
+        </w:rPr>
+        <w:t>wasm</w:t>
+      </w:r>
+      <w:proofErr w:type="spellEnd"/>
+      <w:r>
+        <w:rPr>
+          <w:color w:val="000000" w:themeColor="text1"/>
+          <w:sz w:val="32"/>
+          <w:szCs w:val="32"/>
+        </w:rPr>
+        <w:t xml:space="preserve">, obfuscation doesn’t remove </w:t>
+      </w:r>
+      <w:proofErr w:type="spellStart"/>
+      <w:r>
+        <w:rPr>
+          <w:color w:val="000000" w:themeColor="text1"/>
+          <w:sz w:val="32"/>
+          <w:szCs w:val="32"/>
+        </w:rPr>
+        <w:t>wasm</w:t>
+      </w:r>
+      <w:proofErr w:type="spellEnd"/>
+    </w:p>
+    <w:p>
+      <w:pPr>
+        <w:pStyle w:val="ListParagraph"/>
+        <w:rPr>
+          <w:color w:val="000000" w:themeColor="text1"/>
+          <w:sz w:val="32"/>
+          <w:szCs w:val="32"/>
+        </w:rPr>
+      </w:pPr>
+    </w:p>
+    <w:p>
+      <w:pPr>
+        <w:pStyle w:val="ListParagraph"/>
+        <w:numPr>
+          <w:ilvl w:val="0"/>
+          <w:numId w:val="11"/>
+        </w:numPr>
+        <w:rPr>
+          <w:color w:val="000000" w:themeColor="text1"/>
+          <w:sz w:val="32"/>
+          <w:szCs w:val="32"/>
+        </w:rPr>
+      </w:pPr>
+      <w:r>
+        <w:rPr>
+          <w:color w:val="000000" w:themeColor="text1"/>
+          <w:sz w:val="32"/>
+          <w:szCs w:val="32"/>
+        </w:rPr>
+        <w:t xml:space="preserve">Writing a </w:t>
+      </w:r>
+      <w:proofErr w:type="spellStart"/>
+      <w:r>
+        <w:rPr>
+          <w:color w:val="000000" w:themeColor="text1"/>
+          <w:sz w:val="32"/>
+          <w:szCs w:val="32"/>
+        </w:rPr>
+        <w:t>wasm</w:t>
+      </w:r>
+      <w:proofErr w:type="spellEnd"/>
+      <w:r>
+        <w:rPr>
+          <w:color w:val="000000" w:themeColor="text1"/>
+          <w:sz w:val="32"/>
+          <w:szCs w:val="32"/>
+        </w:rPr>
+        <w:t xml:space="preserve"> detector</w:t>
+      </w:r>
+      <w:r>
+        <w:rPr>
+          <w:color w:val="000000" w:themeColor="text1"/>
+          <w:sz w:val="32"/>
+          <w:szCs w:val="32"/>
+        </w:rPr>
+        <w:t xml:space="preserve"> (indicator 1)</w:t>
+      </w:r>
+    </w:p>
+    <w:p>
+      <w:pPr>
+        <w:pStyle w:val="ListParagraph"/>
+        <w:rPr>
+          <w:color w:val="000000" w:themeColor="text1"/>
+          <w:sz w:val="32"/>
+          <w:szCs w:val="32"/>
+        </w:rPr>
+      </w:pPr>
+    </w:p>
+    <w:p>
+      <w:pPr>
+        <w:pStyle w:val="ListParagraph"/>
+        <w:numPr>
+          <w:ilvl w:val="0"/>
+          <w:numId w:val="11"/>
+        </w:numPr>
+        <w:rPr>
+          <w:color w:val="000000" w:themeColor="text1"/>
+          <w:sz w:val="32"/>
+          <w:szCs w:val="32"/>
+        </w:rPr>
+      </w:pPr>
+      <w:r>
+        <w:rPr>
+          <w:color w:val="000000" w:themeColor="text1"/>
+          <w:sz w:val="32"/>
+          <w:szCs w:val="32"/>
+        </w:rPr>
+        <w:t>Each website was crawled in an isolated browser instance to eliminate caching and cross-site artifacts.</w:t>
+      </w:r>
+    </w:p>
+    <w:p>
+      <w:pPr>
+        <w:pStyle w:val="ListParagraph"/>
+        <w:rPr>
+          <w:color w:val="000000" w:themeColor="text1"/>
+          <w:sz w:val="32"/>
+          <w:szCs w:val="32"/>
+        </w:rPr>
+      </w:pPr>
+    </w:p>
+    <w:p>
+      <w:pPr>
+        <w:pStyle w:val="ListParagraph"/>
+        <w:numPr>
+          <w:ilvl w:val="0"/>
+          <w:numId w:val="11"/>
+        </w:numPr>
+        <w:rPr>
+          <w:color w:val="000000" w:themeColor="text1"/>
+          <w:sz w:val="32"/>
+          <w:szCs w:val="32"/>
+        </w:rPr>
+      </w:pPr>
+      <w:r>
+        <w:rPr>
+          <w:color w:val="000000" w:themeColor="text1"/>
+          <w:sz w:val="32"/>
+          <w:szCs w:val="32"/>
+        </w:rPr>
+        <w:t xml:space="preserve">Runtime </w:t>
+      </w:r>
+      <w:proofErr w:type="spellStart"/>
+      <w:r>
+        <w:rPr>
+          <w:color w:val="000000" w:themeColor="text1"/>
+          <w:sz w:val="32"/>
+          <w:szCs w:val="32"/>
+        </w:rPr>
+        <w:t>Behavior</w:t>
+      </w:r>
+      <w:proofErr w:type="spellEnd"/>
+      <w:r>
+        <w:rPr>
+          <w:color w:val="000000" w:themeColor="text1"/>
+          <w:sz w:val="32"/>
+          <w:szCs w:val="32"/>
+        </w:rPr>
+        <w:t xml:space="preserve"> (CPU + Heap Growth)</w:t>
+      </w:r>
+      <w:r>
+        <w:rPr>
+          <w:color w:val="000000" w:themeColor="text1"/>
+          <w:sz w:val="32"/>
+          <w:szCs w:val="32"/>
+        </w:rPr>
+        <w:t xml:space="preserve"> (indicator 2</w:t>
+      </w:r>
+      <w:r>
+        <w:rPr>
+          <w:color w:val="000000" w:themeColor="text1"/>
+          <w:sz w:val="32"/>
+          <w:szCs w:val="32"/>
+        </w:rPr>
+        <w:t>{anomaly indicator}</w:t>
+      </w:r>
+      <w:r>
+        <w:rPr>
+          <w:color w:val="000000" w:themeColor="text1"/>
+          <w:sz w:val="32"/>
+          <w:szCs w:val="32"/>
+        </w:rPr>
+        <w:t>)</w:t>
+      </w:r>
+    </w:p>
+    <w:p>
+      <w:pPr>
+        <w:pStyle w:val="ListParagraph"/>
+        <w:rPr>
+          <w:color w:val="000000" w:themeColor="text1"/>
+          <w:sz w:val="32"/>
+          <w:szCs w:val="32"/>
+        </w:rPr>
+      </w:pPr>
+    </w:p>
+    <w:p>
+      <w:pPr>
+        <w:pStyle w:val="ListParagraph"/>
+        <w:rPr>
+          <w:color w:val="000000" w:themeColor="text1"/>
+          <w:sz w:val="32"/>
+          <w:szCs w:val="32"/>
+        </w:rPr>
+      </w:pPr>
+      <w:r>
+        <w:rPr>
+          <w:color w:val="000000" w:themeColor="text1"/>
+          <w:sz w:val="32"/>
+          <w:szCs w:val="32"/>
+        </w:rPr>
+        <w:t>Signals (from runtime metrics):</w:t>
+      </w:r>
+    </w:p>
+    <w:p>
+      <w:pPr>
+        <w:pStyle w:val="ListParagraph"/>
+        <w:numPr>
+          <w:ilvl w:val="0"/>
+          <w:numId w:val="12"/>
+        </w:numPr>
+        <w:rPr>
+          <w:color w:val="000000" w:themeColor="text1"/>
+          <w:sz w:val="32"/>
+          <w:szCs w:val="32"/>
+        </w:rPr>
+      </w:pPr>
+      <w:proofErr w:type="spellStart"/>
+      <w:r>
+        <w:rPr>
+          <w:color w:val="000000" w:themeColor="text1"/>
+          <w:sz w:val="32"/>
+          <w:szCs w:val="32"/>
+        </w:rPr>
+        <w:t>JSHeapUsedSize</w:t>
+      </w:r>
+      <w:proofErr w:type="spellEnd"/>
+    </w:p>
+    <w:p>
+      <w:pPr>
+        <w:pStyle w:val="ListParagraph"/>
+        <w:numPr>
+          <w:ilvl w:val="0"/>
+          <w:numId w:val="12"/>
+        </w:numPr>
+        <w:rPr>
+          <w:color w:val="000000" w:themeColor="text1"/>
+          <w:sz w:val="32"/>
+          <w:szCs w:val="32"/>
+        </w:rPr>
+      </w:pPr>
+      <w:proofErr w:type="spellStart"/>
+      <w:r>
+        <w:rPr>
+          <w:color w:val="000000" w:themeColor="text1"/>
+          <w:sz w:val="32"/>
+          <w:szCs w:val="32"/>
+        </w:rPr>
+        <w:t>TaskDuration</w:t>
+      </w:r>
+      <w:proofErr w:type="spellEnd"/>
+    </w:p>
+    <w:p>
+      <w:pPr>
+        <w:pStyle w:val="ListParagraph"/>
+        <w:numPr>
+          <w:ilvl w:val="0"/>
+          <w:numId w:val="12"/>
+        </w:numPr>
+        <w:rPr>
+          <w:color w:val="000000" w:themeColor="text1"/>
+          <w:sz w:val="32"/>
+          <w:szCs w:val="32"/>
+        </w:rPr>
+      </w:pPr>
+      <w:proofErr w:type="spellStart"/>
+      <w:r>
+        <w:rPr>
+          <w:color w:val="000000" w:themeColor="text1"/>
+          <w:sz w:val="32"/>
+          <w:szCs w:val="32"/>
+        </w:rPr>
+        <w:t>ScriptDuration</w:t>
+      </w:r>
+      <w:proofErr w:type="spellEnd"/>
+    </w:p>
+    <w:p>
+      <w:pPr>
+        <w:pStyle w:val="ListParagraph"/>
+        <w:numPr>
+          <w:ilvl w:val="0"/>
+          <w:numId w:val="12"/>
+        </w:numPr>
+        <w:rPr>
+          <w:color w:val="000000" w:themeColor="text1"/>
+          <w:sz w:val="32"/>
+          <w:szCs w:val="32"/>
+        </w:rPr>
+      </w:pPr>
+      <w:proofErr w:type="spellStart"/>
+      <w:r>
+        <w:rPr>
+          <w:color w:val="000000" w:themeColor="text1"/>
+          <w:sz w:val="32"/>
+          <w:szCs w:val="32"/>
+        </w:rPr>
+        <w:t>ProcessTime</w:t>
+      </w:r>
+      <w:proofErr w:type="spellEnd"/>
+    </w:p>
+    <w:p>
+      <w:pPr>
+        <w:pStyle w:val="ListParagraph"/>
+        <w:rPr>
+          <w:color w:val="000000" w:themeColor="text1"/>
+          <w:sz w:val="32"/>
+          <w:szCs w:val="32"/>
+        </w:rPr>
+      </w:pPr>
+    </w:p>
+    <w:p>
+      <w:pPr>
+        <w:pStyle w:val="ListParagraph"/>
+        <w:numPr>
+          <w:ilvl w:val="0"/>
+          <w:numId w:val="11"/>
+        </w:numPr>
+        <w:rPr>
+          <w:color w:val="000000" w:themeColor="text1"/>
+          <w:sz w:val="32"/>
+          <w:szCs w:val="32"/>
+        </w:rPr>
+      </w:pPr>
+      <w:r>
+        <w:rPr>
+          <w:color w:val="000000" w:themeColor="text1"/>
+          <w:sz w:val="32"/>
+          <w:szCs w:val="32"/>
+        </w:rPr>
+        <w:t xml:space="preserve">A site is </w:t>
+      </w:r>
+      <w:r>
+        <w:rPr>
+          <w:color w:val="000000" w:themeColor="text1"/>
+          <w:sz w:val="32"/>
+          <w:szCs w:val="32"/>
+        </w:rPr>
+        <w:t xml:space="preserve">cryptojacking candidate </w:t>
+      </w:r>
+      <w:proofErr w:type="gramStart"/>
+      <w:r>
+        <w:rPr>
+          <w:color w:val="000000" w:themeColor="text1"/>
+          <w:sz w:val="32"/>
+          <w:szCs w:val="32"/>
+        </w:rPr>
+        <w:t>if</w:t>
+      </w:r>
+      <w:r>
+        <w:rPr>
+          <w:color w:val="000000" w:themeColor="text1"/>
+          <w:sz w:val="32"/>
+          <w:szCs w:val="32"/>
+        </w:rPr>
+        <w:t>(</w:t>
+      </w:r>
+      <w:proofErr w:type="gramEnd"/>
+      <w:r>
+        <w:rPr>
+          <w:color w:val="000000" w:themeColor="text1"/>
+          <w:sz w:val="32"/>
+          <w:szCs w:val="32"/>
+        </w:rPr>
+        <w:t xml:space="preserve">False negatives are </w:t>
+      </w:r>
+      <w:r>
+        <w:rPr>
+          <w:color w:val="000000" w:themeColor="text1"/>
+          <w:sz w:val="32"/>
+          <w:szCs w:val="32"/>
+        </w:rPr>
+        <w:t>not</w:t>
+      </w:r>
+      <w:r>
+        <w:rPr>
+          <w:color w:val="000000" w:themeColor="text1"/>
+          <w:sz w:val="32"/>
+          <w:szCs w:val="32"/>
+        </w:rPr>
+        <w:t xml:space="preserve"> acceptable with this</w:t>
+      </w:r>
+      <w:r>
+        <w:rPr>
+          <w:color w:val="000000" w:themeColor="text1"/>
+          <w:sz w:val="32"/>
+          <w:szCs w:val="32"/>
+        </w:rPr>
+        <w:t>)</w:t>
+      </w:r>
+      <w:r>
+        <w:rPr>
+          <w:color w:val="000000" w:themeColor="text1"/>
+          <w:sz w:val="32"/>
+          <w:szCs w:val="32"/>
+        </w:rPr>
+        <w:t>:</w:t>
+      </w:r>
+    </w:p>
+    <w:p>
+      <w:pPr>
+        <w:pStyle w:val="ListParagraph"/>
+        <w:rPr>
+          <w:color w:val="000000" w:themeColor="text1"/>
+          <w:sz w:val="32"/>
+          <w:szCs w:val="32"/>
+        </w:rPr>
+      </w:pPr>
+      <w:r>
+        <w:rPr>
+          <w:color w:val="000000" w:themeColor="text1"/>
+          <w:sz w:val="32"/>
+          <w:szCs w:val="32"/>
+        </w:rPr>
+        <w:t xml:space="preserve">WASM </w:t>
+      </w:r>
+      <w:proofErr w:type="gramStart"/>
+      <w:r>
+        <w:rPr>
+          <w:color w:val="000000" w:themeColor="text1"/>
+          <w:sz w:val="32"/>
+          <w:szCs w:val="32"/>
+        </w:rPr>
+        <w:t>present</w:t>
+      </w:r>
+      <w:r>
+        <w:rPr>
+          <w:color w:val="000000" w:themeColor="text1"/>
+          <w:sz w:val="32"/>
+          <w:szCs w:val="32"/>
+        </w:rPr>
+        <w:t>(</w:t>
+      </w:r>
+      <w:proofErr w:type="gramEnd"/>
+      <w:r>
+        <w:rPr>
+          <w:color w:val="000000" w:themeColor="text1"/>
+          <w:sz w:val="32"/>
+          <w:szCs w:val="32"/>
+        </w:rPr>
+        <w:t>indicator 1</w:t>
+      </w:r>
+      <w:proofErr w:type="gramStart"/>
+      <w:r>
+        <w:rPr>
+          <w:color w:val="000000" w:themeColor="text1"/>
+          <w:sz w:val="32"/>
+          <w:szCs w:val="32"/>
+        </w:rPr>
+        <w:t>)</w:t>
+      </w:r>
+      <w:r>
+        <w:rPr>
+          <w:color w:val="000000" w:themeColor="text1"/>
+          <w:sz w:val="32"/>
+          <w:szCs w:val="32"/>
+        </w:rPr>
+        <w:t xml:space="preserve">  OR</w:t>
+      </w:r>
+      <w:proofErr w:type="gramEnd"/>
+      <w:r>
+        <w:rPr>
+          <w:color w:val="000000" w:themeColor="text1"/>
+          <w:sz w:val="32"/>
+          <w:szCs w:val="32"/>
+        </w:rPr>
+        <w:t xml:space="preserve">  suspicious runtime </w:t>
+      </w:r>
+      <w:proofErr w:type="spellStart"/>
+      <w:proofErr w:type="gramStart"/>
+      <w:r>
+        <w:rPr>
+          <w:color w:val="000000" w:themeColor="text1"/>
+          <w:sz w:val="32"/>
+          <w:szCs w:val="32"/>
+        </w:rPr>
+        <w:t>behavior</w:t>
+      </w:r>
+      <w:proofErr w:type="spellEnd"/>
+      <w:r>
+        <w:rPr>
+          <w:color w:val="000000" w:themeColor="text1"/>
+          <w:sz w:val="32"/>
+          <w:szCs w:val="32"/>
+        </w:rPr>
+        <w:t>(</w:t>
+      </w:r>
+      <w:proofErr w:type="gramEnd"/>
+      <w:r>
+        <w:rPr>
+          <w:color w:val="000000" w:themeColor="text1"/>
+          <w:sz w:val="32"/>
+          <w:szCs w:val="32"/>
+        </w:rPr>
+        <w:t>indicator 2)</w:t>
+      </w:r>
+    </w:p>
+    <w:p>
+      <w:pPr>
+        <w:pStyle w:val="ListParagraph"/>
+        <w:rPr>
+          <w:color w:val="000000" w:themeColor="text1"/>
+          <w:sz w:val="32"/>
+          <w:szCs w:val="32"/>
+        </w:rPr>
+      </w:pPr>
+    </w:p>
+    <w:p>
+      <w:pPr>
+        <w:pStyle w:val="ListParagraph"/>
+        <w:numPr>
+          <w:ilvl w:val="0"/>
+          <w:numId w:val="11"/>
+        </w:numPr>
+        <w:rPr>
+          <w:color w:val="000000" w:themeColor="text1"/>
+          <w:sz w:val="32"/>
+          <w:szCs w:val="32"/>
+        </w:rPr>
+      </w:pPr>
+      <w:r>
+        <w:rPr>
+          <w:color w:val="000000" w:themeColor="text1"/>
+          <w:sz w:val="32"/>
+          <w:szCs w:val="32"/>
+        </w:rPr>
+        <w:t>Candidate list generation</w:t>
+      </w:r>
+      <w:r>
+        <w:rPr>
+          <w:color w:val="000000" w:themeColor="text1"/>
+          <w:sz w:val="32"/>
+          <w:szCs w:val="32"/>
+        </w:rPr>
+        <w:t xml:space="preserve"> and saving them</w:t>
+      </w:r>
+    </w:p>
+    <w:p>
+      <w:pPr>
+        <w:ind w:left="360"/>
+        <w:rPr>
+          <w:color w:val="000000" w:themeColor="text1"/>
+          <w:sz w:val="32"/>
+          <w:szCs w:val="32"/>
+        </w:rPr>
+      </w:pPr>
+    </w:p>
+    <w:p>
+      <w:pPr>
+        <w:ind w:left="360"/>
+        <w:rPr>
+          <w:color w:val="000000" w:themeColor="text1"/>
+          <w:sz w:val="32"/>
+          <w:szCs w:val="32"/>
+        </w:rPr>
+      </w:pPr>
+      <w:r>
+        <w:rPr>
+          <w:color w:val="000000" w:themeColor="text1"/>
+          <w:sz w:val="32"/>
+          <w:szCs w:val="32"/>
+        </w:rPr>
+        <w:t>Difference b/w deep and fast crawl</w:t>
+      </w:r>
+    </w:p>
+    <w:tbl>
+      <w:tblPr>
+        <w:tblW w:w="0" w:type="auto"/>
+        <w:tblCellSpacing w:w="15" w:type="dxa"/>
+        <w:tblCellMar>
+          <w:top w:w="15" w:type="dxa"/>
+          <w:left w:w="15" w:type="dxa"/>
+          <w:bottom w:w="15" w:type="dxa"/>
+          <w:right w:w="15" w:type="dxa"/>
+        </w:tblCellMar>
+        <w:tblLook w:val="04A0" w:firstRow="1" w:lastRow="0" w:firstColumn="1" w:lastColumn="0" w:noHBand="0" w:noVBand="1"/>
+      </w:tblPr>
+      <w:tblGrid>
+        <w:gridCol w:w="2196"/>
+        <w:gridCol w:w="1278"/>
+        <w:gridCol w:w="1831"/>
+      </w:tblGrid>
+      <w:tr>
+        <w:trPr>
+          <w:tblHeader/>
+          <w:tblCellSpacing w:w="15" w:type="dxa"/>
+        </w:trPr>
+        <w:tc>
+          <w:tcPr>
+            <w:tcW w:w="0" w:type="auto"/>
+            <w:vAlign w:val="center"/>
+            <w:hideMark/>
+          </w:tcPr>
+          <w:p>
+            <w:pPr>
+              <w:ind w:left="360"/>
+              <w:rPr>
+                <w:rFonts w:cstheme="minorHAnsi"/>
+                <w:color w:val="000000" w:themeColor="text1"/>
+              </w:rPr>
+            </w:pPr>
+            <w:r>
+              <w:rPr>
+                <w:rFonts w:cstheme="minorHAnsi"/>
+                <w:color w:val="000000" w:themeColor="text1"/>
+              </w:rPr>
+              <w:t>Aspect</w:t>
+            </w:r>
+          </w:p>
+        </w:tc>
+        <w:tc>
+          <w:tcPr>
+            <w:tcW w:w="0" w:type="auto"/>
+            <w:vAlign w:val="center"/>
+            <w:hideMark/>
+          </w:tcPr>
+          <w:p>
+            <w:pPr>
+              <w:ind w:left="360"/>
+              <w:rPr>
+                <w:rFonts w:cstheme="minorHAnsi"/>
+                <w:color w:val="000000" w:themeColor="text1"/>
+              </w:rPr>
+            </w:pPr>
+            <w:r>
+              <w:rPr>
+                <w:rFonts w:cstheme="minorHAnsi"/>
+                <w:color w:val="000000" w:themeColor="text1"/>
+              </w:rPr>
+              <w:t>FAST</w:t>
+            </w:r>
+          </w:p>
+        </w:tc>
+        <w:tc>
+          <w:tcPr>
+            <w:tcW w:w="0" w:type="auto"/>
+            <w:vAlign w:val="center"/>
+            <w:hideMark/>
+          </w:tcPr>
+          <w:p>
+            <w:pPr>
+              <w:ind w:left="360"/>
+              <w:rPr>
+                <w:rFonts w:cstheme="minorHAnsi"/>
+                <w:color w:val="000000" w:themeColor="text1"/>
+              </w:rPr>
+            </w:pPr>
+            <w:r>
+              <w:rPr>
+                <w:rFonts w:cstheme="minorHAnsi"/>
+                <w:color w:val="000000" w:themeColor="text1"/>
+              </w:rPr>
+              <w:t>DEEP</w:t>
+            </w:r>
+          </w:p>
+        </w:tc>
+      </w:tr>
+      <w:tr>
+        <w:trPr>
+          <w:tblCellSpacing w:w="15" w:type="dxa"/>
+        </w:trPr>
+        <w:tc>
+          <w:tcPr>
+            <w:tcW w:w="0" w:type="auto"/>
+            <w:vAlign w:val="center"/>
+            <w:hideMark/>
+          </w:tcPr>
+          <w:p>
+            <w:pPr>
+              <w:ind w:left="360"/>
+              <w:rPr>
+                <w:rFonts w:cstheme="minorHAnsi"/>
+                <w:color w:val="000000" w:themeColor="text1"/>
+              </w:rPr>
+            </w:pPr>
+            <w:r>
+              <w:rPr>
+                <w:rFonts w:cstheme="minorHAnsi"/>
+                <w:color w:val="000000" w:themeColor="text1"/>
+              </w:rPr>
+              <w:t>WAIT_TIME</w:t>
+            </w:r>
+          </w:p>
+        </w:tc>
+        <w:tc>
+          <w:tcPr>
+            <w:tcW w:w="0" w:type="auto"/>
+            <w:vAlign w:val="center"/>
+            <w:hideMark/>
+          </w:tcPr>
+          <w:p>
+            <w:pPr>
+              <w:ind w:left="360"/>
+              <w:rPr>
+                <w:rFonts w:cstheme="minorHAnsi"/>
+                <w:color w:val="000000" w:themeColor="text1"/>
+              </w:rPr>
+            </w:pPr>
+            <w:r>
+              <w:rPr>
+                <w:rFonts w:cstheme="minorHAnsi"/>
+                <w:color w:val="000000" w:themeColor="text1"/>
+              </w:rPr>
+              <w:t>5s</w:t>
+            </w:r>
+          </w:p>
+        </w:tc>
+        <w:tc>
+          <w:tcPr>
+            <w:tcW w:w="0" w:type="auto"/>
+            <w:vAlign w:val="center"/>
+            <w:hideMark/>
+          </w:tcPr>
+          <w:p>
+            <w:pPr>
+              <w:ind w:left="360"/>
+              <w:rPr>
+                <w:rFonts w:cstheme="minorHAnsi"/>
+                <w:color w:val="000000" w:themeColor="text1"/>
+              </w:rPr>
+            </w:pPr>
+            <w:r>
+              <w:rPr>
+                <w:rFonts w:cstheme="minorHAnsi"/>
+                <w:color w:val="000000" w:themeColor="text1"/>
+              </w:rPr>
+              <w:t>15s</w:t>
+            </w:r>
+          </w:p>
+        </w:tc>
+      </w:tr>
+      <w:tr>
+        <w:trPr>
+          <w:tblCellSpacing w:w="15" w:type="dxa"/>
+        </w:trPr>
+        <w:tc>
+          <w:tcPr>
+            <w:tcW w:w="0" w:type="auto"/>
+            <w:vAlign w:val="center"/>
+            <w:hideMark/>
+          </w:tcPr>
+          <w:p>
+            <w:pPr>
+              <w:ind w:left="360"/>
+              <w:rPr>
+                <w:rFonts w:cstheme="minorHAnsi"/>
+                <w:color w:val="000000" w:themeColor="text1"/>
+              </w:rPr>
+            </w:pPr>
+            <w:r>
+              <w:rPr>
+                <w:rFonts w:cstheme="minorHAnsi"/>
+                <w:color w:val="000000" w:themeColor="text1"/>
+              </w:rPr>
+              <w:t>METRIC_DURATION</w:t>
+            </w:r>
+          </w:p>
+        </w:tc>
+        <w:tc>
+          <w:tcPr>
+            <w:tcW w:w="0" w:type="auto"/>
+            <w:vAlign w:val="center"/>
+            <w:hideMark/>
+          </w:tcPr>
+          <w:p>
+            <w:pPr>
+              <w:ind w:left="360"/>
+              <w:rPr>
+                <w:rFonts w:cstheme="minorHAnsi"/>
+                <w:color w:val="000000" w:themeColor="text1"/>
+              </w:rPr>
+            </w:pPr>
+            <w:r>
+              <w:rPr>
+                <w:rFonts w:cstheme="minorHAnsi"/>
+                <w:color w:val="000000" w:themeColor="text1"/>
+              </w:rPr>
+              <w:t>10s</w:t>
+            </w:r>
+          </w:p>
+        </w:tc>
+        <w:tc>
+          <w:tcPr>
+            <w:tcW w:w="0" w:type="auto"/>
+            <w:vAlign w:val="center"/>
+            <w:hideMark/>
+          </w:tcPr>
+          <w:p>
+            <w:pPr>
+              <w:ind w:left="360"/>
+              <w:rPr>
+                <w:rFonts w:cstheme="minorHAnsi"/>
+                <w:color w:val="000000" w:themeColor="text1"/>
+              </w:rPr>
+            </w:pPr>
+            <w:r>
+              <w:rPr>
+                <w:rFonts w:cstheme="minorHAnsi"/>
+                <w:color w:val="000000" w:themeColor="text1"/>
+              </w:rPr>
+              <w:t>30s</w:t>
+            </w:r>
+          </w:p>
+        </w:tc>
+      </w:tr>
+      <w:tr>
+        <w:trPr>
+          <w:tblCellSpacing w:w="15" w:type="dxa"/>
+        </w:trPr>
+        <w:tc>
+          <w:tcPr>
+            <w:tcW w:w="0" w:type="auto"/>
+            <w:vAlign w:val="center"/>
+            <w:hideMark/>
+          </w:tcPr>
+          <w:p>
+            <w:pPr>
+              <w:ind w:left="360"/>
+              <w:rPr>
+                <w:rFonts w:cstheme="minorHAnsi"/>
+                <w:color w:val="000000" w:themeColor="text1"/>
+              </w:rPr>
+            </w:pPr>
+            <w:r>
+              <w:rPr>
+                <w:rFonts w:cstheme="minorHAnsi"/>
+                <w:color w:val="000000" w:themeColor="text1"/>
+              </w:rPr>
+              <w:t>HTML saved</w:t>
+            </w:r>
+          </w:p>
+        </w:tc>
+        <w:tc>
+          <w:tcPr>
+            <w:tcW w:w="0" w:type="auto"/>
+            <w:vAlign w:val="center"/>
+            <w:hideMark/>
+          </w:tcPr>
+          <w:p>
+            <w:pPr>
+              <w:ind w:left="360"/>
+              <w:rPr>
+                <w:rFonts w:cstheme="minorHAnsi"/>
+                <w:color w:val="000000" w:themeColor="text1"/>
+              </w:rPr>
+            </w:pPr>
+            <w:r>
+              <w:rPr>
+                <w:rFonts w:ascii="Segoe UI Emoji" w:hAnsi="Segoe UI Emoji" w:cs="Segoe UI Emoji"/>
+                <w:color w:val="000000" w:themeColor="text1"/>
+              </w:rPr>
+              <w:t>❌</w:t>
+            </w:r>
+          </w:p>
+        </w:tc>
+        <w:tc>
+          <w:tcPr>
+            <w:tcW w:w="0" w:type="auto"/>
+            <w:vAlign w:val="center"/>
+            <w:hideMark/>
+          </w:tcPr>
+          <w:p>
+            <w:pPr>
+              <w:ind w:left="360"/>
+              <w:rPr>
+                <w:rFonts w:cstheme="minorHAnsi"/>
+                <w:color w:val="000000" w:themeColor="text1"/>
+              </w:rPr>
+            </w:pPr>
+            <w:r>
+              <w:rPr>
+                <w:rFonts w:ascii="Segoe UI Emoji" w:hAnsi="Segoe UI Emoji" w:cs="Segoe UI Emoji"/>
+                <w:color w:val="000000" w:themeColor="text1"/>
+              </w:rPr>
+              <w:t>✅</w:t>
+            </w:r>
+          </w:p>
+        </w:tc>
+      </w:tr>
+      <w:tr>
+        <w:trPr>
+          <w:tblCellSpacing w:w="15" w:type="dxa"/>
+        </w:trPr>
+        <w:tc>
+          <w:tcPr>
+            <w:tcW w:w="0" w:type="auto"/>
+            <w:vAlign w:val="center"/>
+            <w:hideMark/>
+          </w:tcPr>
+          <w:p>
+            <w:pPr>
+              <w:ind w:left="360"/>
+              <w:rPr>
+                <w:rFonts w:cstheme="minorHAnsi"/>
+                <w:color w:val="000000" w:themeColor="text1"/>
+              </w:rPr>
+            </w:pPr>
+            <w:r>
+              <w:rPr>
+                <w:rFonts w:cstheme="minorHAnsi"/>
+                <w:color w:val="000000" w:themeColor="text1"/>
+              </w:rPr>
+              <w:t>Sites crawled</w:t>
+            </w:r>
+          </w:p>
+        </w:tc>
+        <w:tc>
+          <w:tcPr>
+            <w:tcW w:w="0" w:type="auto"/>
+            <w:vAlign w:val="center"/>
+            <w:hideMark/>
+          </w:tcPr>
+          <w:p>
+            <w:pPr>
+              <w:ind w:left="360"/>
+              <w:rPr>
+                <w:rFonts w:cstheme="minorHAnsi"/>
+                <w:color w:val="000000" w:themeColor="text1"/>
+              </w:rPr>
+            </w:pPr>
+            <w:r>
+              <w:rPr>
+                <w:rFonts w:cstheme="minorHAnsi"/>
+                <w:color w:val="000000" w:themeColor="text1"/>
+              </w:rPr>
+              <w:t>many</w:t>
+            </w:r>
+          </w:p>
+        </w:tc>
+        <w:tc>
+          <w:tcPr>
+            <w:tcW w:w="0" w:type="auto"/>
+            <w:vAlign w:val="center"/>
+            <w:hideMark/>
+          </w:tcPr>
+          <w:p>
+            <w:pPr>
+              <w:ind w:left="360"/>
+              <w:rPr>
+                <w:rFonts w:cstheme="minorHAnsi"/>
+                <w:color w:val="000000" w:themeColor="text1"/>
+              </w:rPr>
+            </w:pPr>
+            <w:r>
+              <w:rPr>
+                <w:rFonts w:cstheme="minorHAnsi"/>
+                <w:color w:val="000000" w:themeColor="text1"/>
+              </w:rPr>
+              <w:t>only candidates</w:t>
+            </w:r>
+          </w:p>
+        </w:tc>
+      </w:tr>
+      <w:tr>
+        <w:trPr>
+          <w:tblCellSpacing w:w="15" w:type="dxa"/>
+        </w:trPr>
+        <w:tc>
+          <w:tcPr>
+            <w:tcW w:w="0" w:type="auto"/>
+            <w:vAlign w:val="center"/>
+            <w:hideMark/>
+          </w:tcPr>
+          <w:p>
+            <w:pPr>
+              <w:ind w:left="360"/>
+              <w:rPr>
+                <w:rFonts w:cstheme="minorHAnsi"/>
+                <w:color w:val="000000" w:themeColor="text1"/>
+              </w:rPr>
+            </w:pPr>
+            <w:r>
+              <w:rPr>
+                <w:rFonts w:cstheme="minorHAnsi"/>
+                <w:color w:val="000000" w:themeColor="text1"/>
+              </w:rPr>
+              <w:t>Purpose</w:t>
+            </w:r>
+          </w:p>
+        </w:tc>
+        <w:tc>
+          <w:tcPr>
+            <w:tcW w:w="0" w:type="auto"/>
+            <w:vAlign w:val="center"/>
+            <w:hideMark/>
+          </w:tcPr>
+          <w:p>
+            <w:pPr>
+              <w:ind w:left="360"/>
+              <w:rPr>
+                <w:rFonts w:cstheme="minorHAnsi"/>
+                <w:color w:val="000000" w:themeColor="text1"/>
+              </w:rPr>
+            </w:pPr>
+            <w:r>
+              <w:rPr>
+                <w:rFonts w:cstheme="minorHAnsi"/>
+                <w:color w:val="000000" w:themeColor="text1"/>
+              </w:rPr>
+              <w:t>screening</w:t>
+            </w:r>
+          </w:p>
+        </w:tc>
+        <w:tc>
+          <w:tcPr>
+            <w:tcW w:w="0" w:type="auto"/>
+            <w:vAlign w:val="center"/>
+            <w:hideMark/>
+          </w:tcPr>
+          <w:p>
+            <w:pPr>
+              <w:ind w:left="360"/>
+              <w:rPr>
+                <w:rFonts w:cstheme="minorHAnsi"/>
+                <w:color w:val="000000" w:themeColor="text1"/>
+              </w:rPr>
+            </w:pPr>
+            <w:r>
+              <w:rPr>
+                <w:rFonts w:cstheme="minorHAnsi"/>
+                <w:color w:val="000000" w:themeColor="text1"/>
+              </w:rPr>
+              <w:t>final dataset</w:t>
+            </w:r>
+          </w:p>
+        </w:tc>
+      </w:tr>
+    </w:tbl>
+    <w:p>
+      <w:pPr>
+        <w:pStyle w:val="ListParagraph"/>
+        <w:numPr>
+          <w:ilvl w:val="0"/>
+          <w:numId w:val="11"/>
+        </w:numPr>
+        <w:rPr>
+          <w:color w:val="000000" w:themeColor="text1"/>
+          <w:sz w:val="32"/>
+          <w:szCs w:val="32"/>
+        </w:rPr>
+      </w:pPr>
+      <w:r>
+        <w:rPr>
+          <w:color w:val="000000" w:themeColor="text1"/>
+          <w:sz w:val="32"/>
+          <w:szCs w:val="32"/>
+        </w:rPr>
+        <w:lastRenderedPageBreak/>
+        <w:t>Deep crawl on cryptojacking candidates</w:t>
+      </w:r>
+    </w:p>
+    <w:p>
+      <w:pPr>
+        <w:pStyle w:val="ListParagraph"/>
+        <w:numPr>
+          <w:ilvl w:val="0"/>
+          <w:numId w:val="11"/>
+        </w:numPr>
+        <w:rPr>
+          <w:color w:val="000000" w:themeColor="text1"/>
+          <w:sz w:val="32"/>
+          <w:szCs w:val="32"/>
+        </w:rPr>
+      </w:pPr>
+      <w:proofErr w:type="spellStart"/>
+      <w:r>
+        <w:rPr>
+          <w:color w:val="000000" w:themeColor="text1"/>
+          <w:sz w:val="32"/>
+          <w:szCs w:val="32"/>
+        </w:rPr>
+        <w:t>Wasm</w:t>
+      </w:r>
+      <w:proofErr w:type="spellEnd"/>
+      <w:r>
+        <w:rPr>
+          <w:color w:val="000000" w:themeColor="text1"/>
+          <w:sz w:val="32"/>
+          <w:szCs w:val="32"/>
+        </w:rPr>
+        <w:t xml:space="preserve"> -&gt; runtime -&gt; </w:t>
+      </w:r>
+      <w:proofErr w:type="gramStart"/>
+      <w:r>
+        <w:rPr>
+          <w:color w:val="000000" w:themeColor="text1"/>
+          <w:sz w:val="32"/>
+          <w:szCs w:val="32"/>
+        </w:rPr>
+        <w:t>select  (</w:t>
+      </w:r>
+      <w:proofErr w:type="gramEnd"/>
+      <w:r>
+        <w:rPr>
+          <w:color w:val="000000" w:themeColor="text1"/>
+          <w:sz w:val="32"/>
+          <w:szCs w:val="32"/>
+        </w:rPr>
+        <w:t>run order for candidate generation)</w:t>
+      </w:r>
+    </w:p>
+    <w:p>
+      <w:pPr>
+        <w:pStyle w:val="ListParagraph"/>
+        <w:numPr>
+          <w:ilvl w:val="0"/>
+          <w:numId w:val="11"/>
+        </w:numPr>
+        <w:rPr>
+          <w:color w:val="000000" w:themeColor="text1"/>
+          <w:sz w:val="32"/>
+          <w:szCs w:val="32"/>
+        </w:rPr>
+      </w:pPr>
+      <w:r>
+        <w:rPr>
+          <w:color w:val="000000" w:themeColor="text1"/>
+          <w:sz w:val="32"/>
+          <w:szCs w:val="32"/>
+        </w:rPr>
+        <w:t xml:space="preserve">Fast -&gt; indicators -&gt; </w:t>
+      </w:r>
+      <w:proofErr w:type="gramStart"/>
+      <w:r>
+        <w:rPr>
+          <w:color w:val="000000" w:themeColor="text1"/>
+          <w:sz w:val="32"/>
+          <w:szCs w:val="32"/>
+        </w:rPr>
+        <w:t>deep</w:t>
+      </w:r>
+      <w:r>
+        <w:rPr>
+          <w:color w:val="000000" w:themeColor="text1"/>
+          <w:sz w:val="32"/>
+          <w:szCs w:val="32"/>
+        </w:rPr>
+        <w:t xml:space="preserve">  (</w:t>
+      </w:r>
+      <w:proofErr w:type="gramEnd"/>
+      <w:r>
+        <w:rPr>
+          <w:color w:val="000000" w:themeColor="text1"/>
+          <w:sz w:val="32"/>
+          <w:szCs w:val="32"/>
+        </w:rPr>
+        <w:t>may include false positives)</w:t>
+      </w:r>
+      <w:r>
+        <w:rPr>
+          <w:color w:val="000000" w:themeColor="text1"/>
+          <w:sz w:val="32"/>
+          <w:szCs w:val="32"/>
+        </w:rPr>
+        <w:t xml:space="preserve">, heavy </w:t>
+      </w:r>
+      <w:proofErr w:type="spellStart"/>
+      <w:r>
+        <w:rPr>
+          <w:color w:val="000000" w:themeColor="text1"/>
+          <w:sz w:val="32"/>
+          <w:szCs w:val="32"/>
+        </w:rPr>
+        <w:t>js</w:t>
+      </w:r>
+      <w:proofErr w:type="spellEnd"/>
+      <w:r>
+        <w:rPr>
+          <w:color w:val="000000" w:themeColor="text1"/>
+          <w:sz w:val="32"/>
+          <w:szCs w:val="32"/>
+        </w:rPr>
+        <w:t xml:space="preserve"> sites may come</w:t>
+      </w:r>
+    </w:p>
+    <w:p>
+      <w:pPr>
+        <w:pStyle w:val="ListParagraph"/>
+        <w:numPr>
+          <w:ilvl w:val="0"/>
+          <w:numId w:val="11"/>
+        </w:numPr>
+        <w:rPr>
+          <w:color w:val="000000" w:themeColor="text1"/>
+          <w:sz w:val="32"/>
+          <w:szCs w:val="32"/>
+        </w:rPr>
+      </w:pPr>
+      <w:r>
+        <w:rPr>
+          <w:color w:val="000000" w:themeColor="text1"/>
+          <w:sz w:val="32"/>
+          <w:szCs w:val="32"/>
+        </w:rPr>
+        <w:t>With validation pipeline complete Working towards final labelled dataset</w:t>
+      </w:r>
+    </w:p>
+    <w:p>
+      <w:pPr>
+        <w:pStyle w:val="ListParagraph"/>
+        <w:numPr>
+          <w:ilvl w:val="0"/>
+          <w:numId w:val="13"/>
+        </w:numPr>
+        <w:rPr>
+          <w:color w:val="000000" w:themeColor="text1"/>
+          <w:sz w:val="32"/>
+          <w:szCs w:val="32"/>
+        </w:rPr>
+      </w:pPr>
+      <w:r>
+        <w:rPr>
+          <w:color w:val="000000" w:themeColor="text1"/>
+          <w:sz w:val="32"/>
+          <w:szCs w:val="32"/>
+        </w:rPr>
+        <w:t xml:space="preserve">Sources for </w:t>
+      </w:r>
+      <w:proofErr w:type="spellStart"/>
+      <w:r>
+        <w:rPr>
+          <w:color w:val="000000" w:themeColor="text1"/>
+          <w:sz w:val="32"/>
+          <w:szCs w:val="32"/>
+        </w:rPr>
+        <w:t>cryptojack</w:t>
+      </w:r>
+      <w:proofErr w:type="spellEnd"/>
+      <w:r>
+        <w:rPr>
+          <w:color w:val="000000" w:themeColor="text1"/>
+          <w:sz w:val="32"/>
+          <w:szCs w:val="32"/>
+        </w:rPr>
+        <w:t xml:space="preserve"> </w:t>
+      </w:r>
+      <w:proofErr w:type="spellStart"/>
+      <w:r>
+        <w:rPr>
+          <w:color w:val="000000" w:themeColor="text1"/>
+          <w:sz w:val="32"/>
+          <w:szCs w:val="32"/>
+        </w:rPr>
+        <w:t>url</w:t>
+      </w:r>
+      <w:proofErr w:type="spellEnd"/>
+      <w:r>
+        <w:rPr>
+          <w:color w:val="000000" w:themeColor="text1"/>
+          <w:sz w:val="32"/>
+          <w:szCs w:val="32"/>
+        </w:rPr>
+        <w:t xml:space="preserve"> – </w:t>
+      </w:r>
+      <w:proofErr w:type="spellStart"/>
+      <w:r>
+        <w:rPr>
+          <w:color w:val="000000" w:themeColor="text1"/>
+          <w:sz w:val="32"/>
+          <w:szCs w:val="32"/>
+        </w:rPr>
+        <w:t>URLhaus</w:t>
+      </w:r>
+      <w:proofErr w:type="spellEnd"/>
+      <w:r>
+        <w:rPr>
+          <w:color w:val="000000" w:themeColor="text1"/>
+          <w:sz w:val="32"/>
+          <w:szCs w:val="32"/>
+        </w:rPr>
+        <w:t xml:space="preserve"> and </w:t>
+      </w:r>
+      <w:proofErr w:type="spellStart"/>
+      <w:r>
+        <w:rPr>
+          <w:color w:val="000000" w:themeColor="text1"/>
+          <w:sz w:val="32"/>
+          <w:szCs w:val="32"/>
+        </w:rPr>
+        <w:t>github</w:t>
+      </w:r>
+      <w:proofErr w:type="spellEnd"/>
+    </w:p>
+    <w:p>
+      <w:pPr>
+        <w:pStyle w:val="ListParagraph"/>
+        <w:numPr>
+          <w:ilvl w:val="0"/>
+          <w:numId w:val="13"/>
+        </w:numPr>
+        <w:rPr>
+          <w:color w:val="000000" w:themeColor="text1"/>
+          <w:sz w:val="32"/>
+          <w:szCs w:val="32"/>
+        </w:rPr>
+      </w:pPr>
+      <w:r>
+        <w:rPr>
+          <w:color w:val="000000" w:themeColor="text1"/>
+          <w:sz w:val="32"/>
+          <w:szCs w:val="32"/>
+        </w:rPr>
+        <w:t xml:space="preserve">For benign </w:t>
+      </w:r>
+      <w:proofErr w:type="spellStart"/>
+      <w:r>
+        <w:rPr>
+          <w:color w:val="000000" w:themeColor="text1"/>
+          <w:sz w:val="32"/>
+          <w:szCs w:val="32"/>
+        </w:rPr>
+        <w:t>urls</w:t>
+      </w:r>
+      <w:proofErr w:type="spellEnd"/>
+      <w:r>
+        <w:rPr>
+          <w:color w:val="000000" w:themeColor="text1"/>
+          <w:sz w:val="32"/>
+          <w:szCs w:val="32"/>
+        </w:rPr>
+        <w:t xml:space="preserve"> – trance top sites</w:t>
+      </w:r>
+    </w:p>
+    <w:p>
+      <w:pPr>
+        <w:pStyle w:val="ListParagraph"/>
+        <w:numPr>
+          <w:ilvl w:val="0"/>
+          <w:numId w:val="13"/>
+        </w:numPr>
+        <w:rPr>
+          <w:color w:val="000000" w:themeColor="text1"/>
+          <w:sz w:val="32"/>
+          <w:szCs w:val="32"/>
+        </w:rPr>
+      </w:pPr>
+      <w:r>
+        <w:rPr>
+          <w:color w:val="000000" w:themeColor="text1"/>
+          <w:sz w:val="32"/>
+          <w:szCs w:val="32"/>
+        </w:rPr>
+        <w:t>Making data fault tolerant</w:t>
+      </w:r>
+      <w:r>
+        <w:rPr>
+          <w:color w:val="000000" w:themeColor="text1"/>
+          <w:sz w:val="32"/>
+          <w:szCs w:val="32"/>
+        </w:rPr>
+        <w:t xml:space="preserve"> – cuz many crypto jacked </w:t>
+      </w:r>
+      <w:proofErr w:type="spellStart"/>
+      <w:r>
+        <w:rPr>
+          <w:color w:val="000000" w:themeColor="text1"/>
+          <w:sz w:val="32"/>
+          <w:szCs w:val="32"/>
+        </w:rPr>
+        <w:t>urls</w:t>
+      </w:r>
+      <w:proofErr w:type="spellEnd"/>
+      <w:r>
+        <w:rPr>
+          <w:color w:val="000000" w:themeColor="text1"/>
+          <w:sz w:val="32"/>
+          <w:szCs w:val="32"/>
+        </w:rPr>
+        <w:t xml:space="preserve"> are </w:t>
+      </w:r>
+      <w:r>
+        <w:rPr>
+          <w:color w:val="000000" w:themeColor="text1"/>
+          <w:sz w:val="32"/>
+          <w:szCs w:val="32"/>
+        </w:rPr>
+        <w:t>may have been</w:t>
+      </w:r>
+      <w:r>
+        <w:rPr>
+          <w:color w:val="000000" w:themeColor="text1"/>
+          <w:sz w:val="32"/>
+          <w:szCs w:val="32"/>
+        </w:rPr>
+        <w:t xml:space="preserve"> taken down</w:t>
+      </w:r>
+      <w:r>
+        <w:rPr>
+          <w:color w:val="000000" w:themeColor="text1"/>
+          <w:sz w:val="32"/>
+          <w:szCs w:val="32"/>
+        </w:rPr>
+        <w:t xml:space="preserve">, </w:t>
+      </w:r>
+      <w:r>
+        <w:rPr>
+          <w:color w:val="000000" w:themeColor="text1"/>
+          <w:sz w:val="32"/>
+          <w:szCs w:val="32"/>
+        </w:rPr>
+        <w:t>which will hinder our crawling process</w:t>
+      </w:r>
+    </w:p>
+    <w:p>
+      <w:pPr>
+        <w:pStyle w:val="ListParagraph"/>
+        <w:ind w:left="1440"/>
+        <w:rPr>
+          <w:color w:val="000000" w:themeColor="text1"/>
+          <w:sz w:val="32"/>
+          <w:szCs w:val="32"/>
+        </w:rPr>
+      </w:pPr>
+    </w:p>
+    <w:p>
+      <w:pPr>
+        <w:ind w:left="360"/>
+        <w:rPr>
+          <w:color w:val="000000" w:themeColor="text1"/>
+          <w:sz w:val="32"/>
+          <w:szCs w:val="32"/>
+        </w:rPr>
+      </w:pPr>
+    </w:p>
+    <w:p>
+      <w:pPr>
+        <w:pStyle w:val="ListParagraph"/>
+        <w:rPr>
+          <w:color w:val="000000" w:themeColor="text1"/>
+          <w:sz w:val="32"/>
+          <w:szCs w:val="32"/>
+        </w:rPr>
+      </w:pPr>
+    </w:p>
+    <w:p>
+      <w:pPr>
+        <w:ind w:left="360"/>
+        <w:rPr>
+          <w:color w:val="000000" w:themeColor="text1"/>
+          <w:sz w:val="32"/>
+          <w:szCs w:val="32"/>
+        </w:rPr>
+      </w:pPr>
+    </w:p>
+    <w:p>
+      <w:pPr>
+        <w:ind w:left="360"/>
+        <w:rPr>
+          <w:color w:val="000000" w:themeColor="text1"/>
+          <w:sz w:val="32"/>
+          <w:szCs w:val="32"/>
+          <w:lang w:val="en-US"/>
+        </w:rPr>
+      </w:pPr>
+    </w:p>
+    <w:p>
+      <w:pPr>
+        <w:rPr>
+          <w:color w:val="000000" w:themeColor="text1"/>
+          <w:sz w:val="32"/>
+          <w:szCs w:val="32"/>
+          <w:lang w:val="en-US"/>
+        </w:rPr>
+      </w:pPr>
     </w:p>
     <w:sectPr>
       <w:headerReference w:type="default" r:id="rId8"/>
@@ -2665,7 +4433,7 @@
   <w:abstractNum w:abstractNumId="1" w15:restartNumberingAfterBreak="0">
     <w:nsid w:val="105A0832"/>
     <w:multiLevelType w:val="hybridMultilevel"/>
-    <w:tmpl w:val="44BE82E4"/>
+    <w:tmpl w:val="D2D4A078"/>
     <w:lvl w:ilvl="0" w:tplc="40090011">
       <w:start w:val="1"/>
       <w:numFmt w:val="decimal"/>
@@ -2841,6 +4609,119 @@
     </w:lvl>
   </w:abstractNum>
   <w:abstractNum w:abstractNumId="3" w15:restartNumberingAfterBreak="0">
+    <w:nsid w:val="25394077"/>
+    <w:multiLevelType w:val="hybridMultilevel"/>
+    <w:tmpl w:val="D15AE2CE"/>
+    <w:lvl w:ilvl="0" w:tplc="40090001">
+      <w:start w:val="1"/>
+      <w:numFmt w:val="bullet"/>
+      <w:lvlText w:val=""/>
+      <w:lvlJc w:val="left"/>
+      <w:pPr>
+        <w:ind w:left="1440" w:hanging="360"/>
+      </w:pPr>
+      <w:rPr>
+        <w:rFonts w:ascii="Symbol" w:hAnsi="Symbol" w:hint="default"/>
+      </w:rPr>
+    </w:lvl>
+    <w:lvl w:ilvl="1" w:tplc="40090003" w:tentative="1">
+      <w:start w:val="1"/>
+      <w:numFmt w:val="bullet"/>
+      <w:lvlText w:val="o"/>
+      <w:lvlJc w:val="left"/>
+      <w:pPr>
+        <w:ind w:left="2160" w:hanging="360"/>
+      </w:pPr>
+      <w:rPr>
+        <w:rFonts w:ascii="Courier New" w:hAnsi="Courier New" w:cs="Courier New" w:hint="default"/>
+      </w:rPr>
+    </w:lvl>
+    <w:lvl w:ilvl="2" w:tplc="40090005" w:tentative="1">
+      <w:start w:val="1"/>
+      <w:numFmt w:val="bullet"/>
+      <w:lvlText w:val=""/>
+      <w:lvlJc w:val="left"/>
+      <w:pPr>
+        <w:ind w:left="2880" w:hanging="360"/>
+      </w:pPr>
+      <w:rPr>
+        <w:rFonts w:ascii="Wingdings" w:hAnsi="Wingdings" w:hint="default"/>
+      </w:rPr>
+    </w:lvl>
+    <w:lvl w:ilvl="3" w:tplc="40090001" w:tentative="1">
+      <w:start w:val="1"/>
+      <w:numFmt w:val="bullet"/>
+      <w:lvlText w:val=""/>
+      <w:lvlJc w:val="left"/>
+      <w:pPr>
+        <w:ind w:left="3600" w:hanging="360"/>
+      </w:pPr>
+      <w:rPr>
+        <w:rFonts w:ascii="Symbol" w:hAnsi="Symbol" w:hint="default"/>
+      </w:rPr>
+    </w:lvl>
+    <w:lvl w:ilvl="4" w:tplc="40090003" w:tentative="1">
+      <w:start w:val="1"/>
+      <w:numFmt w:val="bullet"/>
+      <w:lvlText w:val="o"/>
+      <w:lvlJc w:val="left"/>
+      <w:pPr>
+        <w:ind w:left="4320" w:hanging="360"/>
+      </w:pPr>
+      <w:rPr>
+        <w:rFonts w:ascii="Courier New" w:hAnsi="Courier New" w:cs="Courier New" w:hint="default"/>
+      </w:rPr>
+    </w:lvl>
+    <w:lvl w:ilvl="5" w:tplc="40090005" w:tentative="1">
+      <w:start w:val="1"/>
+      <w:numFmt w:val="bullet"/>
+      <w:lvlText w:val=""/>
+      <w:lvlJc w:val="left"/>
+      <w:pPr>
+        <w:ind w:left="5040" w:hanging="360"/>
+      </w:pPr>
+      <w:rPr>
+        <w:rFonts w:ascii="Wingdings" w:hAnsi="Wingdings" w:hint="default"/>
+      </w:rPr>
+    </w:lvl>
+    <w:lvl w:ilvl="6" w:tplc="40090001" w:tentative="1">
+      <w:start w:val="1"/>
+      <w:numFmt w:val="bullet"/>
+      <w:lvlText w:val=""/>
+      <w:lvlJc w:val="left"/>
+      <w:pPr>
+        <w:ind w:left="5760" w:hanging="360"/>
+      </w:pPr>
+      <w:rPr>
+        <w:rFonts w:ascii="Symbol" w:hAnsi="Symbol" w:hint="default"/>
+      </w:rPr>
+    </w:lvl>
+    <w:lvl w:ilvl="7" w:tplc="40090003" w:tentative="1">
+      <w:start w:val="1"/>
+      <w:numFmt w:val="bullet"/>
+      <w:lvlText w:val="o"/>
+      <w:lvlJc w:val="left"/>
+      <w:pPr>
+        <w:ind w:left="6480" w:hanging="360"/>
+      </w:pPr>
+      <w:rPr>
+        <w:rFonts w:ascii="Courier New" w:hAnsi="Courier New" w:cs="Courier New" w:hint="default"/>
+      </w:rPr>
+    </w:lvl>
+    <w:lvl w:ilvl="8" w:tplc="40090005" w:tentative="1">
+      <w:start w:val="1"/>
+      <w:numFmt w:val="bullet"/>
+      <w:lvlText w:val=""/>
+      <w:lvlJc w:val="left"/>
+      <w:pPr>
+        <w:ind w:left="7200" w:hanging="360"/>
+      </w:pPr>
+      <w:rPr>
+        <w:rFonts w:ascii="Wingdings" w:hAnsi="Wingdings" w:hint="default"/>
+      </w:rPr>
+    </w:lvl>
+  </w:abstractNum>
+  <w:abstractNum w:abstractNumId="4" w15:restartNumberingAfterBreak="0">
     <w:nsid w:val="2B6C118C"/>
     <w:multiLevelType w:val="hybridMultilevel"/>
     <w:tmpl w:val="C80CEEEC"/>
@@ -2929,7 +4810,7 @@
       </w:pPr>
     </w:lvl>
   </w:abstractNum>
-  <w:abstractNum w:abstractNumId="4" w15:restartNumberingAfterBreak="0">
+  <w:abstractNum w:abstractNumId="5" w15:restartNumberingAfterBreak="0">
     <w:nsid w:val="326C1A2C"/>
     <w:multiLevelType w:val="hybridMultilevel"/>
     <w:tmpl w:val="8CAABC72"/>
@@ -3018,7 +4899,7 @@
       </w:pPr>
     </w:lvl>
   </w:abstractNum>
-  <w:abstractNum w:abstractNumId="5" w15:restartNumberingAfterBreak="0">
+  <w:abstractNum w:abstractNumId="6" w15:restartNumberingAfterBreak="0">
     <w:nsid w:val="334E6BC1"/>
     <w:multiLevelType w:val="multilevel"/>
     <w:tmpl w:val="400C5742"/>
@@ -3135,7 +5016,7 @@
       </w:pPr>
     </w:lvl>
   </w:abstractNum>
-  <w:abstractNum w:abstractNumId="6" w15:restartNumberingAfterBreak="0">
+  <w:abstractNum w:abstractNumId="7" w15:restartNumberingAfterBreak="0">
     <w:nsid w:val="3C4C7F3D"/>
     <w:multiLevelType w:val="hybridMultilevel"/>
     <w:tmpl w:val="E4565250"/>
@@ -3248,7 +5129,7 @@
       </w:rPr>
     </w:lvl>
   </w:abstractNum>
-  <w:abstractNum w:abstractNumId="7" w15:restartNumberingAfterBreak="0">
+  <w:abstractNum w:abstractNumId="8" w15:restartNumberingAfterBreak="0">
     <w:nsid w:val="4C9230D7"/>
     <w:multiLevelType w:val="multilevel"/>
     <w:tmpl w:val="B6103722"/>
@@ -3397,7 +5278,7 @@
       </w:rPr>
     </w:lvl>
   </w:abstractNum>
-  <w:abstractNum w:abstractNumId="8" w15:restartNumberingAfterBreak="0">
+  <w:abstractNum w:abstractNumId="9" w15:restartNumberingAfterBreak="0">
     <w:nsid w:val="4E3C169F"/>
     <w:multiLevelType w:val="multilevel"/>
     <w:tmpl w:val="F9025D48"/>
@@ -3546,7 +5427,7 @@
       </w:rPr>
     </w:lvl>
   </w:abstractNum>
-  <w:abstractNum w:abstractNumId="9" w15:restartNumberingAfterBreak="0">
+  <w:abstractNum w:abstractNumId="10" w15:restartNumberingAfterBreak="0">
     <w:nsid w:val="5E3973F0"/>
     <w:multiLevelType w:val="multilevel"/>
     <w:tmpl w:val="42BA2528"/>
@@ -3695,7 +5576,7 @@
       </w:rPr>
     </w:lvl>
   </w:abstractNum>
-  <w:abstractNum w:abstractNumId="10" w15:restartNumberingAfterBreak="0">
+  <w:abstractNum w:abstractNumId="11" w15:restartNumberingAfterBreak="0">
     <w:nsid w:val="6CC62DC5"/>
     <w:multiLevelType w:val="multilevel"/>
     <w:tmpl w:val="4E265920"/>
@@ -3841,6 +5722,119 @@
       <w:rPr>
         <w:rFonts w:ascii="Wingdings" w:hAnsi="Wingdings" w:hint="default"/>
         <w:sz w:val="20"/>
+      </w:rPr>
+    </w:lvl>
+  </w:abstractNum>
+  <w:abstractNum w:abstractNumId="12" w15:restartNumberingAfterBreak="0">
+    <w:nsid w:val="7BD612F3"/>
+    <w:multiLevelType w:val="hybridMultilevel"/>
+    <w:tmpl w:val="73424CF2"/>
+    <w:lvl w:ilvl="0" w:tplc="40090001">
+      <w:start w:val="1"/>
+      <w:numFmt w:val="bullet"/>
+      <w:lvlText w:val=""/>
+      <w:lvlJc w:val="left"/>
+      <w:pPr>
+        <w:ind w:left="1440" w:hanging="360"/>
+      </w:pPr>
+      <w:rPr>
+        <w:rFonts w:ascii="Symbol" w:hAnsi="Symbol" w:hint="default"/>
+      </w:rPr>
+    </w:lvl>
+    <w:lvl w:ilvl="1" w:tplc="40090003" w:tentative="1">
+      <w:start w:val="1"/>
+      <w:numFmt w:val="bullet"/>
+      <w:lvlText w:val="o"/>
+      <w:lvlJc w:val="left"/>
+      <w:pPr>
+        <w:ind w:left="2160" w:hanging="360"/>
+      </w:pPr>
+      <w:rPr>
+        <w:rFonts w:ascii="Courier New" w:hAnsi="Courier New" w:cs="Courier New" w:hint="default"/>
+      </w:rPr>
+    </w:lvl>
+    <w:lvl w:ilvl="2" w:tplc="40090005" w:tentative="1">
+      <w:start w:val="1"/>
+      <w:numFmt w:val="bullet"/>
+      <w:lvlText w:val=""/>
+      <w:lvlJc w:val="left"/>
+      <w:pPr>
+        <w:ind w:left="2880" w:hanging="360"/>
+      </w:pPr>
+      <w:rPr>
+        <w:rFonts w:ascii="Wingdings" w:hAnsi="Wingdings" w:hint="default"/>
+      </w:rPr>
+    </w:lvl>
+    <w:lvl w:ilvl="3" w:tplc="40090001" w:tentative="1">
+      <w:start w:val="1"/>
+      <w:numFmt w:val="bullet"/>
+      <w:lvlText w:val=""/>
+      <w:lvlJc w:val="left"/>
+      <w:pPr>
+        <w:ind w:left="3600" w:hanging="360"/>
+      </w:pPr>
+      <w:rPr>
+        <w:rFonts w:ascii="Symbol" w:hAnsi="Symbol" w:hint="default"/>
+      </w:rPr>
+    </w:lvl>
+    <w:lvl w:ilvl="4" w:tplc="40090003" w:tentative="1">
+      <w:start w:val="1"/>
+      <w:numFmt w:val="bullet"/>
+      <w:lvlText w:val="o"/>
+      <w:lvlJc w:val="left"/>
+      <w:pPr>
+        <w:ind w:left="4320" w:hanging="360"/>
+      </w:pPr>
+      <w:rPr>
+        <w:rFonts w:ascii="Courier New" w:hAnsi="Courier New" w:cs="Courier New" w:hint="default"/>
+      </w:rPr>
+    </w:lvl>
+    <w:lvl w:ilvl="5" w:tplc="40090005" w:tentative="1">
+      <w:start w:val="1"/>
+      <w:numFmt w:val="bullet"/>
+      <w:lvlText w:val=""/>
+      <w:lvlJc w:val="left"/>
+      <w:pPr>
+        <w:ind w:left="5040" w:hanging="360"/>
+      </w:pPr>
+      <w:rPr>
+        <w:rFonts w:ascii="Wingdings" w:hAnsi="Wingdings" w:hint="default"/>
+      </w:rPr>
+    </w:lvl>
+    <w:lvl w:ilvl="6" w:tplc="40090001" w:tentative="1">
+      <w:start w:val="1"/>
+      <w:numFmt w:val="bullet"/>
+      <w:lvlText w:val=""/>
+      <w:lvlJc w:val="left"/>
+      <w:pPr>
+        <w:ind w:left="5760" w:hanging="360"/>
+      </w:pPr>
+      <w:rPr>
+        <w:rFonts w:ascii="Symbol" w:hAnsi="Symbol" w:hint="default"/>
+      </w:rPr>
+    </w:lvl>
+    <w:lvl w:ilvl="7" w:tplc="40090003" w:tentative="1">
+      <w:start w:val="1"/>
+      <w:numFmt w:val="bullet"/>
+      <w:lvlText w:val="o"/>
+      <w:lvlJc w:val="left"/>
+      <w:pPr>
+        <w:ind w:left="6480" w:hanging="360"/>
+      </w:pPr>
+      <w:rPr>
+        <w:rFonts w:ascii="Courier New" w:hAnsi="Courier New" w:cs="Courier New" w:hint="default"/>
+      </w:rPr>
+    </w:lvl>
+    <w:lvl w:ilvl="8" w:tplc="40090005" w:tentative="1">
+      <w:start w:val="1"/>
+      <w:numFmt w:val="bullet"/>
+      <w:lvlText w:val=""/>
+      <w:lvlJc w:val="left"/>
+      <w:pPr>
+        <w:ind w:left="7200" w:hanging="360"/>
+      </w:pPr>
+      <w:rPr>
+        <w:rFonts w:ascii="Wingdings" w:hAnsi="Wingdings" w:hint="default"/>
       </w:rPr>
     </w:lvl>
   </w:abstractNum>
@@ -3848,34 +5842,40 @@
     <w:abstractNumId w:val="2"/>
   </w:num>
   <w:num w:numId="2" w16cid:durableId="1054891536">
-    <w:abstractNumId w:val="3"/>
+    <w:abstractNumId w:val="4"/>
   </w:num>
   <w:num w:numId="3" w16cid:durableId="1162504431">
-    <w:abstractNumId w:val="6"/>
+    <w:abstractNumId w:val="7"/>
   </w:num>
   <w:num w:numId="4" w16cid:durableId="1696732756">
+    <w:abstractNumId w:val="10"/>
+  </w:num>
+  <w:num w:numId="5" w16cid:durableId="269581402">
     <w:abstractNumId w:val="9"/>
   </w:num>
-  <w:num w:numId="5" w16cid:durableId="269581402">
+  <w:num w:numId="6" w16cid:durableId="1348214902">
     <w:abstractNumId w:val="8"/>
-  </w:num>
-  <w:num w:numId="6" w16cid:durableId="1348214902">
-    <w:abstractNumId w:val="7"/>
   </w:num>
   <w:num w:numId="7" w16cid:durableId="1937134232">
     <w:abstractNumId w:val="0"/>
   </w:num>
   <w:num w:numId="8" w16cid:durableId="1430857086">
-    <w:abstractNumId w:val="10"/>
+    <w:abstractNumId w:val="11"/>
   </w:num>
   <w:num w:numId="9" w16cid:durableId="1971128667">
-    <w:abstractNumId w:val="5"/>
+    <w:abstractNumId w:val="6"/>
   </w:num>
   <w:num w:numId="10" w16cid:durableId="1507983401">
-    <w:abstractNumId w:val="4"/>
+    <w:abstractNumId w:val="5"/>
   </w:num>
   <w:num w:numId="11" w16cid:durableId="1297030142">
     <w:abstractNumId w:val="1"/>
+  </w:num>
+  <w:num w:numId="12" w16cid:durableId="602108075">
+    <w:abstractNumId w:val="3"/>
+  </w:num>
+  <w:num w:numId="13" w16cid:durableId="100926606">
+    <w:abstractNumId w:val="12"/>
   </w:num>
 </w:numbering>
 </file>
@@ -4308,7 +6308,6 @@
     <w:next w:val="Normal"/>
     <w:link w:val="Heading2Char"/>
     <w:uiPriority w:val="9"/>
-    <w:semiHidden/>
     <w:unhideWhenUsed/>
     <w:qFormat/>
     <w:rsid w:val="00311038"/>
@@ -4524,7 +6523,6 @@
     <w:basedOn w:val="DefaultParagraphFont"/>
     <w:link w:val="Heading2"/>
     <w:uiPriority w:val="9"/>
-    <w:semiHidden/>
     <w:rsid w:val="00311038"/>
     <w:rPr>
       <w:rFonts w:asciiTheme="majorHAnsi" w:eastAsiaTheme="majorEastAsia" w:hAnsiTheme="majorHAnsi" w:cstheme="majorBidi"/>
@@ -4840,6 +6838,36 @@
     <w:uiPriority w:val="99"/>
     <w:rsid w:val="009447B3"/>
   </w:style>
+  <w:style w:type="paragraph" w:styleId="NormalWeb">
+    <w:name w:val="Normal (Web)"/>
+    <w:basedOn w:val="Normal"/>
+    <w:uiPriority w:val="99"/>
+    <w:semiHidden/>
+    <w:unhideWhenUsed/>
+    <w:rsid w:val="006A0416"/>
+    <w:pPr>
+      <w:spacing w:before="100" w:beforeAutospacing="1" w:after="100" w:afterAutospacing="1" w:line="240" w:lineRule="auto"/>
+    </w:pPr>
+    <w:rPr>
+      <w:rFonts w:ascii="Times New Roman" w:eastAsia="Times New Roman" w:hAnsi="Times New Roman" w:cs="Times New Roman"/>
+      <w:kern w:val="0"/>
+      <w:sz w:val="24"/>
+      <w:szCs w:val="24"/>
+      <w:lang w:eastAsia="en-IN"/>
+      <w14:ligatures w14:val="none"/>
+    </w:rPr>
+  </w:style>
+  <w:style w:type="character" w:styleId="Strong">
+    <w:name w:val="Strong"/>
+    <w:basedOn w:val="DefaultParagraphFont"/>
+    <w:uiPriority w:val="22"/>
+    <w:qFormat/>
+    <w:rsid w:val="006A0416"/>
+    <w:rPr>
+      <w:b/>
+      <w:bCs/>
+    </w:rPr>
+  </w:style>
 </w:styles>
 </file>
 

</xml_diff>

<commit_message>
Add benign domian list and update crawler
</commit_message>
<xml_diff>
--- a/project_capstone.docx
+++ b/project_capstone.docx
@@ -4119,6 +4119,311 @@
           <w:lang w:val="en-US"/>
         </w:rPr>
       </w:pPr>
+      <w:r>
+        <w:rPr>
+          <w:color w:val="000000" w:themeColor="text1"/>
+          <w:sz w:val="32"/>
+          <w:szCs w:val="32"/>
+          <w:lang w:val="en-US"/>
+        </w:rPr>
+        <w:t>27</w:t>
+      </w:r>
+    </w:p>
+    <w:p>
+      <w:pPr>
+        <w:pStyle w:val="ListParagraph"/>
+        <w:numPr>
+          <w:ilvl w:val="0"/>
+          <w:numId w:val="14"/>
+        </w:numPr>
+        <w:rPr>
+          <w:color w:val="000000" w:themeColor="text1"/>
+          <w:sz w:val="32"/>
+          <w:szCs w:val="32"/>
+          <w:lang w:val="en-US"/>
+        </w:rPr>
+      </w:pPr>
+      <w:r>
+        <w:rPr>
+          <w:color w:val="000000" w:themeColor="text1"/>
+          <w:sz w:val="32"/>
+          <w:szCs w:val="32"/>
+          <w:lang w:val="en-US"/>
+        </w:rPr>
+        <w:t xml:space="preserve">89 crypto samples, now fast crawling over </w:t>
+      </w:r>
+      <w:r>
+        <w:rPr>
+          <w:color w:val="000000" w:themeColor="text1"/>
+          <w:sz w:val="32"/>
+          <w:szCs w:val="32"/>
+          <w:lang w:val="en-US"/>
+        </w:rPr>
+        <w:t xml:space="preserve">160 benign </w:t>
+      </w:r>
+      <w:r>
+        <w:rPr>
+          <w:color w:val="000000" w:themeColor="text1"/>
+          <w:sz w:val="32"/>
+          <w:szCs w:val="32"/>
+          <w:lang w:val="en-US"/>
+        </w:rPr>
+        <w:t>samples</w:t>
+      </w:r>
+    </w:p>
+    <w:p>
+      <w:pPr>
+        <w:pStyle w:val="ListParagraph"/>
+        <w:numPr>
+          <w:ilvl w:val="0"/>
+          <w:numId w:val="14"/>
+        </w:numPr>
+        <w:rPr>
+          <w:color w:val="000000" w:themeColor="text1"/>
+          <w:sz w:val="32"/>
+          <w:szCs w:val="32"/>
+          <w:lang w:val="en-US"/>
+        </w:rPr>
+      </w:pPr>
+      <w:r>
+        <w:rPr>
+          <w:color w:val="000000" w:themeColor="text1"/>
+          <w:sz w:val="32"/>
+          <w:szCs w:val="32"/>
+          <w:lang w:val="en-US"/>
+        </w:rPr>
+        <w:t xml:space="preserve">Currently have </w:t>
+      </w:r>
+      <w:r>
+        <w:rPr>
+          <w:color w:val="000000" w:themeColor="text1"/>
+          <w:sz w:val="32"/>
+          <w:szCs w:val="32"/>
+          <w:lang w:val="en-US"/>
+        </w:rPr>
+        <w:t>89 crypto and 177 benign with fast crawl</w:t>
+      </w:r>
+    </w:p>
+    <w:p>
+      <w:pPr>
+        <w:pStyle w:val="ListParagraph"/>
+        <w:numPr>
+          <w:ilvl w:val="0"/>
+          <w:numId w:val="14"/>
+        </w:numPr>
+        <w:rPr>
+          <w:color w:val="000000" w:themeColor="text1"/>
+          <w:sz w:val="32"/>
+          <w:szCs w:val="32"/>
+          <w:lang w:val="en-US"/>
+        </w:rPr>
+      </w:pPr>
+      <w:r>
+        <w:rPr>
+          <w:color w:val="000000" w:themeColor="text1"/>
+          <w:sz w:val="32"/>
+          <w:szCs w:val="32"/>
+          <w:lang w:val="en-US"/>
+        </w:rPr>
+        <w:t xml:space="preserve">Now we have </w:t>
+      </w:r>
+      <w:r>
+        <w:rPr>
+          <w:color w:val="000000" w:themeColor="text1"/>
+          <w:sz w:val="32"/>
+          <w:szCs w:val="32"/>
+          <w:lang w:val="en-US"/>
+        </w:rPr>
+        <w:t xml:space="preserve">runtime metrics (time series), network logs, and early execution </w:t>
+      </w:r>
+      <w:proofErr w:type="spellStart"/>
+      <w:r>
+        <w:rPr>
+          <w:color w:val="000000" w:themeColor="text1"/>
+          <w:sz w:val="32"/>
+          <w:szCs w:val="32"/>
+          <w:lang w:val="en-US"/>
+        </w:rPr>
+        <w:t>behaviour</w:t>
+      </w:r>
+      <w:proofErr w:type="spellEnd"/>
+    </w:p>
+    <w:p>
+      <w:pPr>
+        <w:pStyle w:val="ListParagraph"/>
+        <w:numPr>
+          <w:ilvl w:val="0"/>
+          <w:numId w:val="14"/>
+        </w:numPr>
+        <w:rPr>
+          <w:color w:val="000000" w:themeColor="text1"/>
+          <w:sz w:val="32"/>
+          <w:szCs w:val="32"/>
+          <w:lang w:val="en-US"/>
+        </w:rPr>
+      </w:pPr>
+      <w:proofErr w:type="gramStart"/>
+      <w:r>
+        <w:rPr>
+          <w:color w:val="000000" w:themeColor="text1"/>
+          <w:sz w:val="32"/>
+          <w:szCs w:val="32"/>
+          <w:lang w:val="en-US"/>
+        </w:rPr>
+        <w:t>Its</w:t>
+      </w:r>
+      <w:proofErr w:type="gramEnd"/>
+      <w:r>
+        <w:rPr>
+          <w:color w:val="000000" w:themeColor="text1"/>
+          <w:sz w:val="32"/>
+          <w:szCs w:val="32"/>
+          <w:lang w:val="en-US"/>
+        </w:rPr>
+        <w:t xml:space="preserve"> perfect for early detection, anomaly detection, and </w:t>
+      </w:r>
+      <w:proofErr w:type="spellStart"/>
+      <w:proofErr w:type="gramStart"/>
+      <w:r>
+        <w:rPr>
+          <w:color w:val="000000" w:themeColor="text1"/>
+          <w:sz w:val="32"/>
+          <w:szCs w:val="32"/>
+          <w:lang w:val="en-US"/>
+        </w:rPr>
+        <w:t>qml</w:t>
+      </w:r>
+      <w:proofErr w:type="spellEnd"/>
+      <w:r>
+        <w:rPr>
+          <w:color w:val="000000" w:themeColor="text1"/>
+          <w:sz w:val="32"/>
+          <w:szCs w:val="32"/>
+          <w:lang w:val="en-US"/>
+        </w:rPr>
+        <w:t>(</w:t>
+      </w:r>
+      <w:proofErr w:type="gramEnd"/>
+      <w:r>
+        <w:rPr>
+          <w:color w:val="000000" w:themeColor="text1"/>
+          <w:sz w:val="32"/>
+          <w:szCs w:val="32"/>
+          <w:lang w:val="en-US"/>
+        </w:rPr>
+        <w:t xml:space="preserve">which prefers </w:t>
+      </w:r>
+      <w:r>
+        <w:rPr>
+          <w:color w:val="000000" w:themeColor="text1"/>
+          <w:sz w:val="32"/>
+          <w:szCs w:val="32"/>
+          <w:lang w:val="en-US"/>
+        </w:rPr>
+        <w:t>small samples</w:t>
+      </w:r>
+      <w:r>
+        <w:rPr>
+          <w:color w:val="000000" w:themeColor="text1"/>
+          <w:sz w:val="32"/>
+          <w:szCs w:val="32"/>
+          <w:lang w:val="en-US"/>
+        </w:rPr>
+        <w:t>)</w:t>
+      </w:r>
+    </w:p>
+    <w:p>
+      <w:pPr>
+        <w:pStyle w:val="ListParagraph"/>
+        <w:numPr>
+          <w:ilvl w:val="0"/>
+          <w:numId w:val="14"/>
+        </w:numPr>
+        <w:rPr>
+          <w:color w:val="000000" w:themeColor="text1"/>
+          <w:sz w:val="32"/>
+          <w:szCs w:val="32"/>
+          <w:lang w:val="en-US"/>
+        </w:rPr>
+      </w:pPr>
+      <w:r>
+        <w:rPr>
+          <w:color w:val="000000" w:themeColor="text1"/>
+          <w:sz w:val="32"/>
+          <w:szCs w:val="32"/>
+          <w:lang w:val="en-US"/>
+        </w:rPr>
+        <w:t xml:space="preserve">Next steps for today will be - &gt; </w:t>
+      </w:r>
+    </w:p>
+    <w:p>
+      <w:pPr>
+        <w:pStyle w:val="ListParagraph"/>
+        <w:numPr>
+          <w:ilvl w:val="0"/>
+          <w:numId w:val="15"/>
+        </w:numPr>
+        <w:rPr>
+          <w:color w:val="000000" w:themeColor="text1"/>
+          <w:sz w:val="32"/>
+          <w:szCs w:val="32"/>
+          <w:lang w:val="en-US"/>
+        </w:rPr>
+      </w:pPr>
+      <w:r>
+        <w:rPr>
+          <w:color w:val="000000" w:themeColor="text1"/>
+          <w:sz w:val="32"/>
+          <w:szCs w:val="32"/>
+        </w:rPr>
+        <w:t xml:space="preserve">Dataset finalization &amp; </w:t>
+      </w:r>
+      <w:r>
+        <w:rPr>
+          <w:color w:val="000000" w:themeColor="text1"/>
+          <w:sz w:val="32"/>
+          <w:szCs w:val="32"/>
+        </w:rPr>
+        <w:t>labelling</w:t>
+      </w:r>
+    </w:p>
+    <w:p>
+      <w:pPr>
+        <w:pStyle w:val="ListParagraph"/>
+        <w:numPr>
+          <w:ilvl w:val="0"/>
+          <w:numId w:val="15"/>
+        </w:numPr>
+        <w:rPr>
+          <w:color w:val="000000" w:themeColor="text1"/>
+          <w:sz w:val="32"/>
+          <w:szCs w:val="32"/>
+          <w:lang w:val="en-US"/>
+        </w:rPr>
+      </w:pPr>
+      <w:r>
+        <w:rPr>
+          <w:color w:val="000000" w:themeColor="text1"/>
+          <w:sz w:val="32"/>
+          <w:szCs w:val="32"/>
+        </w:rPr>
+        <w:t>Feature extraction (from FAST data)</w:t>
+      </w:r>
+    </w:p>
+    <w:p>
+      <w:pPr>
+        <w:pStyle w:val="ListParagraph"/>
+        <w:numPr>
+          <w:ilvl w:val="0"/>
+          <w:numId w:val="15"/>
+        </w:numPr>
+        <w:rPr>
+          <w:color w:val="000000" w:themeColor="text1"/>
+          <w:sz w:val="32"/>
+          <w:szCs w:val="32"/>
+          <w:lang w:val="en-US"/>
+        </w:rPr>
+      </w:pPr>
     </w:p>
     <w:p>
       <w:pPr>
@@ -4520,6 +4825,119 @@
     </w:lvl>
   </w:abstractNum>
   <w:abstractNum w:abstractNumId="2" w15:restartNumberingAfterBreak="0">
+    <w:nsid w:val="11C73E7E"/>
+    <w:multiLevelType w:val="hybridMultilevel"/>
+    <w:tmpl w:val="429EFAB2"/>
+    <w:lvl w:ilvl="0" w:tplc="40090001">
+      <w:start w:val="1"/>
+      <w:numFmt w:val="bullet"/>
+      <w:lvlText w:val=""/>
+      <w:lvlJc w:val="left"/>
+      <w:pPr>
+        <w:ind w:left="1440" w:hanging="360"/>
+      </w:pPr>
+      <w:rPr>
+        <w:rFonts w:ascii="Symbol" w:hAnsi="Symbol" w:hint="default"/>
+      </w:rPr>
+    </w:lvl>
+    <w:lvl w:ilvl="1" w:tplc="40090003" w:tentative="1">
+      <w:start w:val="1"/>
+      <w:numFmt w:val="bullet"/>
+      <w:lvlText w:val="o"/>
+      <w:lvlJc w:val="left"/>
+      <w:pPr>
+        <w:ind w:left="2160" w:hanging="360"/>
+      </w:pPr>
+      <w:rPr>
+        <w:rFonts w:ascii="Courier New" w:hAnsi="Courier New" w:cs="Courier New" w:hint="default"/>
+      </w:rPr>
+    </w:lvl>
+    <w:lvl w:ilvl="2" w:tplc="40090005" w:tentative="1">
+      <w:start w:val="1"/>
+      <w:numFmt w:val="bullet"/>
+      <w:lvlText w:val=""/>
+      <w:lvlJc w:val="left"/>
+      <w:pPr>
+        <w:ind w:left="2880" w:hanging="360"/>
+      </w:pPr>
+      <w:rPr>
+        <w:rFonts w:ascii="Wingdings" w:hAnsi="Wingdings" w:hint="default"/>
+      </w:rPr>
+    </w:lvl>
+    <w:lvl w:ilvl="3" w:tplc="40090001" w:tentative="1">
+      <w:start w:val="1"/>
+      <w:numFmt w:val="bullet"/>
+      <w:lvlText w:val=""/>
+      <w:lvlJc w:val="left"/>
+      <w:pPr>
+        <w:ind w:left="3600" w:hanging="360"/>
+      </w:pPr>
+      <w:rPr>
+        <w:rFonts w:ascii="Symbol" w:hAnsi="Symbol" w:hint="default"/>
+      </w:rPr>
+    </w:lvl>
+    <w:lvl w:ilvl="4" w:tplc="40090003" w:tentative="1">
+      <w:start w:val="1"/>
+      <w:numFmt w:val="bullet"/>
+      <w:lvlText w:val="o"/>
+      <w:lvlJc w:val="left"/>
+      <w:pPr>
+        <w:ind w:left="4320" w:hanging="360"/>
+      </w:pPr>
+      <w:rPr>
+        <w:rFonts w:ascii="Courier New" w:hAnsi="Courier New" w:cs="Courier New" w:hint="default"/>
+      </w:rPr>
+    </w:lvl>
+    <w:lvl w:ilvl="5" w:tplc="40090005" w:tentative="1">
+      <w:start w:val="1"/>
+      <w:numFmt w:val="bullet"/>
+      <w:lvlText w:val=""/>
+      <w:lvlJc w:val="left"/>
+      <w:pPr>
+        <w:ind w:left="5040" w:hanging="360"/>
+      </w:pPr>
+      <w:rPr>
+        <w:rFonts w:ascii="Wingdings" w:hAnsi="Wingdings" w:hint="default"/>
+      </w:rPr>
+    </w:lvl>
+    <w:lvl w:ilvl="6" w:tplc="40090001" w:tentative="1">
+      <w:start w:val="1"/>
+      <w:numFmt w:val="bullet"/>
+      <w:lvlText w:val=""/>
+      <w:lvlJc w:val="left"/>
+      <w:pPr>
+        <w:ind w:left="5760" w:hanging="360"/>
+      </w:pPr>
+      <w:rPr>
+        <w:rFonts w:ascii="Symbol" w:hAnsi="Symbol" w:hint="default"/>
+      </w:rPr>
+    </w:lvl>
+    <w:lvl w:ilvl="7" w:tplc="40090003" w:tentative="1">
+      <w:start w:val="1"/>
+      <w:numFmt w:val="bullet"/>
+      <w:lvlText w:val="o"/>
+      <w:lvlJc w:val="left"/>
+      <w:pPr>
+        <w:ind w:left="6480" w:hanging="360"/>
+      </w:pPr>
+      <w:rPr>
+        <w:rFonts w:ascii="Courier New" w:hAnsi="Courier New" w:cs="Courier New" w:hint="default"/>
+      </w:rPr>
+    </w:lvl>
+    <w:lvl w:ilvl="8" w:tplc="40090005" w:tentative="1">
+      <w:start w:val="1"/>
+      <w:numFmt w:val="bullet"/>
+      <w:lvlText w:val=""/>
+      <w:lvlJc w:val="left"/>
+      <w:pPr>
+        <w:ind w:left="7200" w:hanging="360"/>
+      </w:pPr>
+      <w:rPr>
+        <w:rFonts w:ascii="Wingdings" w:hAnsi="Wingdings" w:hint="default"/>
+      </w:rPr>
+    </w:lvl>
+  </w:abstractNum>
+  <w:abstractNum w:abstractNumId="3" w15:restartNumberingAfterBreak="0">
     <w:nsid w:val="1FDF5F9C"/>
     <w:multiLevelType w:val="hybridMultilevel"/>
     <w:tmpl w:val="DA9A0328"/>
@@ -4608,7 +5026,7 @@
       </w:pPr>
     </w:lvl>
   </w:abstractNum>
-  <w:abstractNum w:abstractNumId="3" w15:restartNumberingAfterBreak="0">
+  <w:abstractNum w:abstractNumId="4" w15:restartNumberingAfterBreak="0">
     <w:nsid w:val="25394077"/>
     <w:multiLevelType w:val="hybridMultilevel"/>
     <w:tmpl w:val="D15AE2CE"/>
@@ -4721,7 +5139,7 @@
       </w:rPr>
     </w:lvl>
   </w:abstractNum>
-  <w:abstractNum w:abstractNumId="4" w15:restartNumberingAfterBreak="0">
+  <w:abstractNum w:abstractNumId="5" w15:restartNumberingAfterBreak="0">
     <w:nsid w:val="2B6C118C"/>
     <w:multiLevelType w:val="hybridMultilevel"/>
     <w:tmpl w:val="C80CEEEC"/>
@@ -4810,7 +5228,7 @@
       </w:pPr>
     </w:lvl>
   </w:abstractNum>
-  <w:abstractNum w:abstractNumId="5" w15:restartNumberingAfterBreak="0">
+  <w:abstractNum w:abstractNumId="6" w15:restartNumberingAfterBreak="0">
     <w:nsid w:val="326C1A2C"/>
     <w:multiLevelType w:val="hybridMultilevel"/>
     <w:tmpl w:val="8CAABC72"/>
@@ -4899,7 +5317,7 @@
       </w:pPr>
     </w:lvl>
   </w:abstractNum>
-  <w:abstractNum w:abstractNumId="6" w15:restartNumberingAfterBreak="0">
+  <w:abstractNum w:abstractNumId="7" w15:restartNumberingAfterBreak="0">
     <w:nsid w:val="334E6BC1"/>
     <w:multiLevelType w:val="multilevel"/>
     <w:tmpl w:val="400C5742"/>
@@ -5016,7 +5434,7 @@
       </w:pPr>
     </w:lvl>
   </w:abstractNum>
-  <w:abstractNum w:abstractNumId="7" w15:restartNumberingAfterBreak="0">
+  <w:abstractNum w:abstractNumId="8" w15:restartNumberingAfterBreak="0">
     <w:nsid w:val="3C4C7F3D"/>
     <w:multiLevelType w:val="hybridMultilevel"/>
     <w:tmpl w:val="E4565250"/>
@@ -5129,7 +5547,7 @@
       </w:rPr>
     </w:lvl>
   </w:abstractNum>
-  <w:abstractNum w:abstractNumId="8" w15:restartNumberingAfterBreak="0">
+  <w:abstractNum w:abstractNumId="9" w15:restartNumberingAfterBreak="0">
     <w:nsid w:val="4C9230D7"/>
     <w:multiLevelType w:val="multilevel"/>
     <w:tmpl w:val="B6103722"/>
@@ -5278,7 +5696,7 @@
       </w:rPr>
     </w:lvl>
   </w:abstractNum>
-  <w:abstractNum w:abstractNumId="9" w15:restartNumberingAfterBreak="0">
+  <w:abstractNum w:abstractNumId="10" w15:restartNumberingAfterBreak="0">
     <w:nsid w:val="4E3C169F"/>
     <w:multiLevelType w:val="multilevel"/>
     <w:tmpl w:val="F9025D48"/>
@@ -5427,7 +5845,96 @@
       </w:rPr>
     </w:lvl>
   </w:abstractNum>
-  <w:abstractNum w:abstractNumId="10" w15:restartNumberingAfterBreak="0">
+  <w:abstractNum w:abstractNumId="11" w15:restartNumberingAfterBreak="0">
+    <w:nsid w:val="513178E9"/>
+    <w:multiLevelType w:val="hybridMultilevel"/>
+    <w:tmpl w:val="319ED946"/>
+    <w:lvl w:ilvl="0" w:tplc="40090011">
+      <w:start w:val="1"/>
+      <w:numFmt w:val="decimal"/>
+      <w:lvlText w:val="%1)"/>
+      <w:lvlJc w:val="left"/>
+      <w:pPr>
+        <w:ind w:left="720" w:hanging="360"/>
+      </w:pPr>
+      <w:rPr>
+        <w:rFonts w:hint="default"/>
+      </w:rPr>
+    </w:lvl>
+    <w:lvl w:ilvl="1" w:tplc="40090019" w:tentative="1">
+      <w:start w:val="1"/>
+      <w:numFmt w:val="lowerLetter"/>
+      <w:lvlText w:val="%2."/>
+      <w:lvlJc w:val="left"/>
+      <w:pPr>
+        <w:ind w:left="1440" w:hanging="360"/>
+      </w:pPr>
+    </w:lvl>
+    <w:lvl w:ilvl="2" w:tplc="4009001B" w:tentative="1">
+      <w:start w:val="1"/>
+      <w:numFmt w:val="lowerRoman"/>
+      <w:lvlText w:val="%3."/>
+      <w:lvlJc w:val="right"/>
+      <w:pPr>
+        <w:ind w:left="2160" w:hanging="180"/>
+      </w:pPr>
+    </w:lvl>
+    <w:lvl w:ilvl="3" w:tplc="4009000F" w:tentative="1">
+      <w:start w:val="1"/>
+      <w:numFmt w:val="decimal"/>
+      <w:lvlText w:val="%4."/>
+      <w:lvlJc w:val="left"/>
+      <w:pPr>
+        <w:ind w:left="2880" w:hanging="360"/>
+      </w:pPr>
+    </w:lvl>
+    <w:lvl w:ilvl="4" w:tplc="40090019" w:tentative="1">
+      <w:start w:val="1"/>
+      <w:numFmt w:val="lowerLetter"/>
+      <w:lvlText w:val="%5."/>
+      <w:lvlJc w:val="left"/>
+      <w:pPr>
+        <w:ind w:left="3600" w:hanging="360"/>
+      </w:pPr>
+    </w:lvl>
+    <w:lvl w:ilvl="5" w:tplc="4009001B" w:tentative="1">
+      <w:start w:val="1"/>
+      <w:numFmt w:val="lowerRoman"/>
+      <w:lvlText w:val="%6."/>
+      <w:lvlJc w:val="right"/>
+      <w:pPr>
+        <w:ind w:left="4320" w:hanging="180"/>
+      </w:pPr>
+    </w:lvl>
+    <w:lvl w:ilvl="6" w:tplc="4009000F" w:tentative="1">
+      <w:start w:val="1"/>
+      <w:numFmt w:val="decimal"/>
+      <w:lvlText w:val="%7."/>
+      <w:lvlJc w:val="left"/>
+      <w:pPr>
+        <w:ind w:left="5040" w:hanging="360"/>
+      </w:pPr>
+    </w:lvl>
+    <w:lvl w:ilvl="7" w:tplc="40090019" w:tentative="1">
+      <w:start w:val="1"/>
+      <w:numFmt w:val="lowerLetter"/>
+      <w:lvlText w:val="%8."/>
+      <w:lvlJc w:val="left"/>
+      <w:pPr>
+        <w:ind w:left="5760" w:hanging="360"/>
+      </w:pPr>
+    </w:lvl>
+    <w:lvl w:ilvl="8" w:tplc="4009001B" w:tentative="1">
+      <w:start w:val="1"/>
+      <w:numFmt w:val="lowerRoman"/>
+      <w:lvlText w:val="%9."/>
+      <w:lvlJc w:val="right"/>
+      <w:pPr>
+        <w:ind w:left="6480" w:hanging="180"/>
+      </w:pPr>
+    </w:lvl>
+  </w:abstractNum>
+  <w:abstractNum w:abstractNumId="12" w15:restartNumberingAfterBreak="0">
     <w:nsid w:val="5E3973F0"/>
     <w:multiLevelType w:val="multilevel"/>
     <w:tmpl w:val="42BA2528"/>
@@ -5576,7 +6083,7 @@
       </w:rPr>
     </w:lvl>
   </w:abstractNum>
-  <w:abstractNum w:abstractNumId="11" w15:restartNumberingAfterBreak="0">
+  <w:abstractNum w:abstractNumId="13" w15:restartNumberingAfterBreak="0">
     <w:nsid w:val="6CC62DC5"/>
     <w:multiLevelType w:val="multilevel"/>
     <w:tmpl w:val="4E265920"/>
@@ -5725,7 +6232,7 @@
       </w:rPr>
     </w:lvl>
   </w:abstractNum>
-  <w:abstractNum w:abstractNumId="12" w15:restartNumberingAfterBreak="0">
+  <w:abstractNum w:abstractNumId="14" w15:restartNumberingAfterBreak="0">
     <w:nsid w:val="7BD612F3"/>
     <w:multiLevelType w:val="hybridMultilevel"/>
     <w:tmpl w:val="73424CF2"/>
@@ -5839,43 +6346,49 @@
     </w:lvl>
   </w:abstractNum>
   <w:num w:numId="1" w16cid:durableId="1400059085">
-    <w:abstractNumId w:val="2"/>
+    <w:abstractNumId w:val="3"/>
   </w:num>
   <w:num w:numId="2" w16cid:durableId="1054891536">
-    <w:abstractNumId w:val="4"/>
+    <w:abstractNumId w:val="5"/>
   </w:num>
   <w:num w:numId="3" w16cid:durableId="1162504431">
-    <w:abstractNumId w:val="7"/>
+    <w:abstractNumId w:val="8"/>
   </w:num>
   <w:num w:numId="4" w16cid:durableId="1696732756">
+    <w:abstractNumId w:val="12"/>
+  </w:num>
+  <w:num w:numId="5" w16cid:durableId="269581402">
     <w:abstractNumId w:val="10"/>
   </w:num>
-  <w:num w:numId="5" w16cid:durableId="269581402">
+  <w:num w:numId="6" w16cid:durableId="1348214902">
     <w:abstractNumId w:val="9"/>
-  </w:num>
-  <w:num w:numId="6" w16cid:durableId="1348214902">
-    <w:abstractNumId w:val="8"/>
   </w:num>
   <w:num w:numId="7" w16cid:durableId="1937134232">
     <w:abstractNumId w:val="0"/>
   </w:num>
   <w:num w:numId="8" w16cid:durableId="1430857086">
-    <w:abstractNumId w:val="11"/>
+    <w:abstractNumId w:val="13"/>
   </w:num>
   <w:num w:numId="9" w16cid:durableId="1971128667">
-    <w:abstractNumId w:val="6"/>
+    <w:abstractNumId w:val="7"/>
   </w:num>
   <w:num w:numId="10" w16cid:durableId="1507983401">
-    <w:abstractNumId w:val="5"/>
+    <w:abstractNumId w:val="6"/>
   </w:num>
   <w:num w:numId="11" w16cid:durableId="1297030142">
     <w:abstractNumId w:val="1"/>
   </w:num>
   <w:num w:numId="12" w16cid:durableId="602108075">
-    <w:abstractNumId w:val="3"/>
+    <w:abstractNumId w:val="4"/>
   </w:num>
   <w:num w:numId="13" w16cid:durableId="100926606">
-    <w:abstractNumId w:val="12"/>
+    <w:abstractNumId w:val="14"/>
+  </w:num>
+  <w:num w:numId="14" w16cid:durableId="1300693642">
+    <w:abstractNumId w:val="11"/>
+  </w:num>
+  <w:num w:numId="15" w16cid:durableId="1706516646">
+    <w:abstractNumId w:val="2"/>
   </w:num>
 </w:numbering>
 </file>

</xml_diff>